<commit_message>
feat: polish line multi-bridge report formatting and fill mapping
Keep filled body text in 宋体小四 with TNR digits, pin appendix captions to 黑体五号, and map line-route-overview so HTML fill lands in the template.

Co-authored-by: Cursor <cursoragent@cursor.com>
</commit_message>
<xml_diff>
--- a/bi-biz/src/main/resources/word.biz/定期检查_普通桥梁线路多桥服务端模板.docx
+++ b/bi-biz/src/main/resources/word.biz/定期检查_普通桥梁线路多桥服务端模板.docx
@@ -277,13 +277,42 @@
       <w:pPr>
         <w:jc w:val="center"/>
         <w:rPr>
-          <w:rFonts w:eastAsia="黑体"/>
+          <w:rFonts w:hint="eastAsia" w:ascii="黑体" w:hAnsi="黑体" w:eastAsia="黑体" w:cs="黑体"/>
           <w:sz w:val="36"/>
           <w:szCs w:val="36"/>
         </w:rPr>
       </w:pPr>
       <w:r>
-        <w:t>${year}年${month}月</w:t>
+        <w:rPr>
+          <w:rFonts w:hint="default" w:ascii="Times New Roman" w:hAnsi="Times New Roman" w:eastAsia="黑体" w:cs="Times New Roman"/>
+          <w:sz w:val="36"/>
+          <w:szCs w:val="36"/>
+        </w:rPr>
+        <w:t>${year}</w:t>
+      </w:r>
+      <w:r>
+        <w:rPr>
+          <w:rFonts w:hint="eastAsia" w:ascii="黑体" w:hAnsi="黑体" w:eastAsia="黑体" w:cs="黑体"/>
+          <w:sz w:val="36"/>
+          <w:szCs w:val="36"/>
+        </w:rPr>
+        <w:t>年</w:t>
+      </w:r>
+      <w:r>
+        <w:rPr>
+          <w:rFonts w:hint="default" w:ascii="Times New Roman" w:hAnsi="Times New Roman" w:eastAsia="黑体" w:cs="Times New Roman"/>
+          <w:sz w:val="36"/>
+          <w:szCs w:val="36"/>
+        </w:rPr>
+        <w:t>${month}</w:t>
+      </w:r>
+      <w:r>
+        <w:rPr>
+          <w:rFonts w:hint="eastAsia" w:ascii="黑体" w:hAnsi="黑体" w:eastAsia="黑体" w:cs="黑体"/>
+          <w:sz w:val="36"/>
+          <w:szCs w:val="36"/>
+        </w:rPr>
+        <w:t>月</w:t>
       </w:r>
     </w:p>
     <w:p>
@@ -860,7 +889,7 @@
               <w:rPr>
                 <w:rFonts w:hint="eastAsia" w:asciiTheme="minorEastAsia" w:hAnsiTheme="minorEastAsia" w:eastAsiaTheme="minorEastAsia" w:cstheme="minorEastAsia"/>
                 <w:b/>
-                <w:bCs/>
+                <w:bCs w:val="0"/>
                 <w:sz w:val="28"/>
                 <w:szCs w:val="28"/>
               </w:rPr>
@@ -5725,7 +5754,7 @@
         <w:sectPr>
           <w:headerReference r:id="rId13" w:type="default"/>
           <w:pgSz w:w="11906" w:h="16838"/>
-          <w:pgMar w:top="1440" w:right="1797" w:bottom="1440" w:left="1797" w:header="624" w:footer="992" w:gutter="0"/>
+          <w:pgMar w:top="1440" w:right="1797" w:bottom="1440" w:left="1797" w:header="397" w:footer="992" w:gutter="0"/>
           <w:pgNumType w:fmt="upperRoman" w:start="1"/>
           <w:cols w:space="425" w:num="1"/>
           <w:docGrid w:type="lines" w:linePitch="312" w:charSpace="0"/>
@@ -5751,13 +5780,13 @@
           <w:szCs w:val="32"/>
         </w:rPr>
       </w:pPr>
-      <w:bookmarkStart w:id="3" w:name="_Toc213786562"/>
-      <w:bookmarkStart w:id="4" w:name="_Toc153983764"/>
-      <w:bookmarkStart w:id="5" w:name="_Toc9625"/>
-      <w:bookmarkStart w:id="6" w:name="_Toc153817471"/>
-      <w:bookmarkStart w:id="7" w:name="_Toc168717081"/>
-      <w:bookmarkStart w:id="8" w:name="_Toc14337"/>
-      <w:bookmarkStart w:id="9" w:name="_Toc168716129"/>
+      <w:bookmarkStart w:id="3" w:name="_Toc153983764"/>
+      <w:bookmarkStart w:id="4" w:name="_Toc213786562"/>
+      <w:bookmarkStart w:id="5" w:name="_Toc14337"/>
+      <w:bookmarkStart w:id="6" w:name="_Toc9625"/>
+      <w:bookmarkStart w:id="7" w:name="_Toc153817471"/>
+      <w:bookmarkStart w:id="8" w:name="_Toc168716129"/>
+      <w:bookmarkStart w:id="9" w:name="_Toc168717081"/>
       <w:r>
         <w:rPr>
           <w:rFonts w:hint="eastAsia" w:ascii="Times New Roman" w:hAnsi="Times New Roman"/>
@@ -5773,18 +5802,8 @@
       <w:r>
         <w:t>${line-route-overview}</w:t>
       </w:r>
-    </w:p>
-    <w:p>
-      <w:r>
-        <w:t>${line-task-source}</w:t>
-      </w:r>
-    </w:p>
-    <w:p>
-      <w:r>
-        <w:t>${line-project-overview}</w:t>
-      </w:r>
-    </w:p>
-    <w:p>
+      <w:bookmarkStart w:id="50" w:name="_GoBack"/>
+      <w:bookmarkEnd w:id="50"/>
       <w:bookmarkStart w:id="10" w:name="_Toc153983765"/>
     </w:p>
     <w:bookmarkEnd w:id="10"/>
@@ -5799,8 +5818,8 @@
           <w:szCs w:val="32"/>
         </w:rPr>
       </w:pPr>
-      <w:bookmarkStart w:id="11" w:name="_Toc213786563"/>
-      <w:bookmarkStart w:id="12" w:name="_Toc153983776"/>
+      <w:bookmarkStart w:id="11" w:name="_Toc153983776"/>
+      <w:bookmarkStart w:id="12" w:name="_Toc213786563"/>
       <w:r>
         <w:rPr>
           <w:rFonts w:hint="eastAsia" w:ascii="Times New Roman" w:hAnsi="Times New Roman"/>
@@ -5918,9 +5937,9 @@
           <w:rFonts w:ascii="Times New Roman" w:hAnsi="Times New Roman" w:cs="Times New Roman"/>
         </w:rPr>
       </w:pPr>
-      <w:bookmarkStart w:id="14" w:name="_Toc213786565"/>
+      <w:bookmarkStart w:id="14" w:name="_Toc88494887"/>
       <w:bookmarkStart w:id="15" w:name="_Toc153817482"/>
-      <w:bookmarkStart w:id="16" w:name="_Toc88494887"/>
+      <w:bookmarkStart w:id="16" w:name="_Toc213786565"/>
       <w:r>
         <w:rPr>
           <w:rFonts w:ascii="Times New Roman" w:hAnsi="Times New Roman" w:cs="Times New Roman"/>
@@ -6437,26 +6456,6 @@
     <w:p>
       <w:pPr>
         <w:pStyle w:val="4"/>
-      </w:pPr>
-      <w:r>
-        <w:t>技术标准</w:t>
-      </w:r>
-    </w:p>
-    <w:p>
-      <w:pPr>
-        <w:rPr>
-          <w:rFonts w:eastAsia="楷体"/>
-          <w:sz w:val="28"/>
-          <w:szCs w:val="28"/>
-        </w:rPr>
-      </w:pPr>
-      <w:r>
-        <w:t>${standard}</w:t>
-      </w:r>
-    </w:p>
-    <w:p>
-      <w:pPr>
-        <w:pStyle w:val="4"/>
         <w:spacing w:before="163" w:after="163"/>
         <w:rPr>
           <w:rFonts w:cs="Times New Roman"/>
@@ -6687,7 +6686,7 @@
         <w:sectPr>
           <w:footerReference r:id="rId14" w:type="default"/>
           <w:pgSz w:w="11906" w:h="16838"/>
-          <w:pgMar w:top="1440" w:right="1797" w:bottom="1440" w:left="1797" w:header="680" w:footer="964" w:gutter="0"/>
+          <w:pgMar w:top="1440" w:right="1797" w:bottom="1440" w:left="1797" w:header="397" w:footer="964" w:gutter="0"/>
           <w:pgNumType w:start="1"/>
           <w:cols w:space="425" w:num="1"/>
           <w:docGrid w:type="lines" w:linePitch="326" w:charSpace="0"/>
@@ -6701,7 +6700,6 @@
         <w:spacing w:before="163" w:after="163"/>
         <w:rPr>
           <w:rFonts w:ascii="Times New Roman" w:hAnsi="Times New Roman"/>
-          <w:bCs w:val="0"/>
         </w:rPr>
       </w:pPr>
       <w:bookmarkStart w:id="27" w:name="_Toc213786579"/>
@@ -6714,41 +6712,6 @@
         <w:t>与上一次检查病害变化情况分析</w:t>
       </w:r>
       <w:bookmarkEnd w:id="27"/>
-      <w:r>
-        <w:rPr>
-          <w:rFonts w:hint="eastAsia" w:ascii="Times New Roman" w:hAnsi="Times New Roman"/>
-          <w:bCs w:val="0"/>
-          <w:color w:val="0000FF"/>
-          <w:lang w:eastAsia="zh-CN"/>
-        </w:rPr>
-        <w:t>（</w:t>
-      </w:r>
-      <w:r>
-        <w:rPr>
-          <w:rFonts w:hint="eastAsia" w:ascii="Times New Roman" w:hAnsi="Times New Roman"/>
-          <w:bCs w:val="0"/>
-          <w:color w:val="0000FF"/>
-          <w:lang w:val="en-US" w:eastAsia="zh-CN"/>
-        </w:rPr>
-        <w:t>未生成，用固定先代替</w:t>
-      </w:r>
-      <w:r>
-        <w:rPr>
-          <w:rFonts w:hint="eastAsia" w:ascii="Times New Roman" w:hAnsi="Times New Roman"/>
-          <w:bCs w:val="0"/>
-          <w:color w:val="0000FF"/>
-          <w:lang w:eastAsia="zh-CN"/>
-        </w:rPr>
-        <w:t>）</w:t>
-      </w:r>
-    </w:p>
-    <w:p>
-      <w:pPr>
-        <w:pStyle w:val="128"/>
-        <w:rPr>
-          <w:rFonts w:ascii="Times New Roman" w:hAnsi="Times New Roman"/>
-        </w:rPr>
-      </w:pPr>
     </w:p>
     <w:p>
       <w:pPr>
@@ -6757,3270 +6720,10 @@
           <w:rFonts w:eastAsia="黑体"/>
         </w:rPr>
       </w:pPr>
+      <w:r>
+        <w:t>${diseaseComparison}</w:t>
+      </w:r>
     </w:p>
-    <w:tbl>
-      <w:tblPr>
-        <w:tblStyle w:val="46"/>
-        <w:tblW w:w="4997" w:type="pct"/>
-        <w:jc w:val="center"/>
-        <w:tblBorders>
-          <w:top w:val="single" w:color="auto" w:sz="4" w:space="0"/>
-          <w:left w:val="single" w:color="auto" w:sz="4" w:space="0"/>
-          <w:bottom w:val="single" w:color="auto" w:sz="4" w:space="0"/>
-          <w:right w:val="single" w:color="auto" w:sz="4" w:space="0"/>
-          <w:insideH w:val="single" w:color="auto" w:sz="4" w:space="0"/>
-          <w:insideV w:val="single" w:color="auto" w:sz="4" w:space="0"/>
-        </w:tblBorders>
-        <w:tblLayout w:type="autofit"/>
-        <w:tblCellMar>
-          <w:top w:w="0" w:type="dxa"/>
-          <w:left w:w="108" w:type="dxa"/>
-          <w:bottom w:w="0" w:type="dxa"/>
-          <w:right w:w="108" w:type="dxa"/>
-        </w:tblCellMar>
-      </w:tblPr>
-      <w:tblGrid>
-        <w:gridCol w:w="1340"/>
-        <w:gridCol w:w="563"/>
-        <w:gridCol w:w="655"/>
-        <w:gridCol w:w="1063"/>
-        <w:gridCol w:w="1466"/>
-        <w:gridCol w:w="862"/>
-        <w:gridCol w:w="2132"/>
-        <w:gridCol w:w="862"/>
-        <w:gridCol w:w="2339"/>
-        <w:gridCol w:w="1616"/>
-        <w:gridCol w:w="1267"/>
-      </w:tblGrid>
-      <w:tr>
-        <w:trPr>
-          <w:tblHeader/>
-          <w:jc w:val="center"/>
-        </w:trPr>
-        <w:tc>
-          <w:tcPr>
-            <w:tcW w:w="473" w:type="pct"/>
-            <w:vMerge w:val="restart"/>
-            <w:vAlign w:val="center"/>
-          </w:tcPr>
-          <w:p>
-            <w:pPr>
-              <w:pStyle w:val="436"/>
-              <w:spacing w:line="240" w:lineRule="exact"/>
-              <w:rPr>
-                <w:b/>
-                <w:bCs/>
-                <w:sz w:val="18"/>
-                <w:szCs w:val="18"/>
-              </w:rPr>
-            </w:pPr>
-            <w:r>
-              <w:rPr>
-                <w:rFonts w:hint="eastAsia"/>
-                <w:b/>
-                <w:bCs/>
-                <w:sz w:val="18"/>
-                <w:szCs w:val="18"/>
-              </w:rPr>
-              <w:t>桥梁名称</w:t>
-            </w:r>
-          </w:p>
-        </w:tc>
-        <w:tc>
-          <w:tcPr>
-            <w:tcW w:w="430" w:type="pct"/>
-            <w:gridSpan w:val="2"/>
-            <w:vMerge w:val="restart"/>
-            <w:vAlign w:val="center"/>
-          </w:tcPr>
-          <w:p>
-            <w:pPr>
-              <w:pStyle w:val="436"/>
-              <w:spacing w:line="240" w:lineRule="exact"/>
-              <w:rPr>
-                <w:b/>
-                <w:bCs/>
-                <w:sz w:val="18"/>
-                <w:szCs w:val="18"/>
-              </w:rPr>
-            </w:pPr>
-            <w:r>
-              <w:rPr>
-                <w:rFonts w:hint="eastAsia"/>
-                <w:b/>
-                <w:bCs/>
-                <w:sz w:val="18"/>
-                <w:szCs w:val="18"/>
-              </w:rPr>
-              <w:t>部位</w:t>
-            </w:r>
-          </w:p>
-        </w:tc>
-        <w:tc>
-          <w:tcPr>
-            <w:tcW w:w="375" w:type="pct"/>
-            <w:vMerge w:val="restart"/>
-            <w:vAlign w:val="center"/>
-          </w:tcPr>
-          <w:p>
-            <w:pPr>
-              <w:pStyle w:val="436"/>
-              <w:spacing w:line="240" w:lineRule="exact"/>
-              <w:rPr>
-                <w:b/>
-                <w:bCs/>
-                <w:sz w:val="18"/>
-                <w:szCs w:val="18"/>
-              </w:rPr>
-            </w:pPr>
-            <w:r>
-              <w:rPr>
-                <w:rFonts w:hint="eastAsia"/>
-                <w:b/>
-                <w:bCs/>
-                <w:sz w:val="18"/>
-                <w:szCs w:val="18"/>
-              </w:rPr>
-              <w:t>构件</w:t>
-            </w:r>
-          </w:p>
-        </w:tc>
-        <w:tc>
-          <w:tcPr>
-            <w:tcW w:w="517" w:type="pct"/>
-            <w:vMerge w:val="restart"/>
-            <w:vAlign w:val="center"/>
-          </w:tcPr>
-          <w:p>
-            <w:pPr>
-              <w:pStyle w:val="436"/>
-              <w:spacing w:line="240" w:lineRule="exact"/>
-              <w:rPr>
-                <w:b/>
-                <w:bCs/>
-                <w:sz w:val="18"/>
-                <w:szCs w:val="18"/>
-              </w:rPr>
-            </w:pPr>
-            <w:r>
-              <w:rPr>
-                <w:rFonts w:hint="eastAsia"/>
-                <w:b/>
-                <w:bCs/>
-                <w:sz w:val="18"/>
-                <w:szCs w:val="18"/>
-              </w:rPr>
-              <w:t>病害种类</w:t>
-            </w:r>
-          </w:p>
-        </w:tc>
-        <w:tc>
-          <w:tcPr>
-            <w:tcW w:w="1056" w:type="pct"/>
-            <w:gridSpan w:val="2"/>
-            <w:vAlign w:val="center"/>
-          </w:tcPr>
-          <w:p>
-            <w:pPr>
-              <w:pStyle w:val="436"/>
-              <w:spacing w:line="240" w:lineRule="exact"/>
-              <w:rPr>
-                <w:b/>
-                <w:bCs/>
-                <w:sz w:val="18"/>
-                <w:szCs w:val="18"/>
-              </w:rPr>
-            </w:pPr>
-            <w:r>
-              <w:rPr>
-                <w:rFonts w:hint="eastAsia"/>
-                <w:b/>
-                <w:bCs/>
-                <w:sz w:val="18"/>
-                <w:szCs w:val="18"/>
-              </w:rPr>
-              <w:t>2023</w:t>
-            </w:r>
-          </w:p>
-        </w:tc>
-        <w:tc>
-          <w:tcPr>
-            <w:tcW w:w="1129" w:type="pct"/>
-            <w:gridSpan w:val="2"/>
-            <w:vAlign w:val="center"/>
-          </w:tcPr>
-          <w:p>
-            <w:pPr>
-              <w:pStyle w:val="436"/>
-              <w:spacing w:line="240" w:lineRule="exact"/>
-              <w:rPr>
-                <w:b/>
-                <w:bCs/>
-                <w:sz w:val="18"/>
-                <w:szCs w:val="18"/>
-              </w:rPr>
-            </w:pPr>
-            <w:r>
-              <w:rPr>
-                <w:rFonts w:hint="eastAsia"/>
-                <w:b/>
-                <w:bCs/>
-                <w:sz w:val="18"/>
-                <w:szCs w:val="18"/>
-              </w:rPr>
-              <w:t>2024</w:t>
-            </w:r>
-          </w:p>
-        </w:tc>
-        <w:tc>
-          <w:tcPr>
-            <w:tcW w:w="570" w:type="pct"/>
-            <w:vMerge w:val="restart"/>
-            <w:vAlign w:val="center"/>
-          </w:tcPr>
-          <w:p>
-            <w:pPr>
-              <w:pStyle w:val="436"/>
-              <w:spacing w:line="240" w:lineRule="exact"/>
-              <w:rPr>
-                <w:b/>
-                <w:bCs/>
-                <w:sz w:val="18"/>
-                <w:szCs w:val="18"/>
-              </w:rPr>
-            </w:pPr>
-            <w:r>
-              <w:rPr>
-                <w:rFonts w:hint="eastAsia"/>
-                <w:b/>
-                <w:bCs/>
-                <w:sz w:val="18"/>
-                <w:szCs w:val="18"/>
-              </w:rPr>
-              <w:t>发展情况</w:t>
-            </w:r>
-          </w:p>
-        </w:tc>
-        <w:tc>
-          <w:tcPr>
-            <w:tcW w:w="447" w:type="pct"/>
-            <w:vMerge w:val="restart"/>
-            <w:vAlign w:val="center"/>
-          </w:tcPr>
-          <w:p>
-            <w:pPr>
-              <w:pStyle w:val="436"/>
-              <w:spacing w:line="240" w:lineRule="exact"/>
-              <w:rPr>
-                <w:b/>
-                <w:bCs/>
-                <w:sz w:val="18"/>
-                <w:szCs w:val="18"/>
-              </w:rPr>
-            </w:pPr>
-            <w:r>
-              <w:rPr>
-                <w:rFonts w:hint="eastAsia"/>
-                <w:b/>
-                <w:bCs/>
-                <w:sz w:val="18"/>
-                <w:szCs w:val="18"/>
-              </w:rPr>
-              <w:t>备注</w:t>
-            </w:r>
-          </w:p>
-        </w:tc>
-      </w:tr>
-      <w:tr>
-        <w:trPr>
-          <w:tblHeader/>
-          <w:jc w:val="center"/>
-        </w:trPr>
-        <w:tc>
-          <w:tcPr>
-            <w:tcW w:w="473" w:type="pct"/>
-            <w:vMerge w:val="continue"/>
-            <w:vAlign w:val="center"/>
-          </w:tcPr>
-          <w:p>
-            <w:pPr>
-              <w:pStyle w:val="436"/>
-              <w:spacing w:line="240" w:lineRule="exact"/>
-              <w:rPr>
-                <w:sz w:val="18"/>
-                <w:szCs w:val="18"/>
-              </w:rPr>
-            </w:pPr>
-          </w:p>
-        </w:tc>
-        <w:tc>
-          <w:tcPr>
-            <w:tcW w:w="430" w:type="pct"/>
-            <w:gridSpan w:val="2"/>
-            <w:vMerge w:val="continue"/>
-            <w:vAlign w:val="center"/>
-          </w:tcPr>
-          <w:p>
-            <w:pPr>
-              <w:pStyle w:val="436"/>
-              <w:spacing w:line="240" w:lineRule="exact"/>
-              <w:rPr>
-                <w:sz w:val="18"/>
-                <w:szCs w:val="18"/>
-              </w:rPr>
-            </w:pPr>
-          </w:p>
-        </w:tc>
-        <w:tc>
-          <w:tcPr>
-            <w:tcW w:w="375" w:type="pct"/>
-            <w:vMerge w:val="continue"/>
-            <w:vAlign w:val="center"/>
-          </w:tcPr>
-          <w:p>
-            <w:pPr>
-              <w:pStyle w:val="436"/>
-              <w:spacing w:line="240" w:lineRule="exact"/>
-              <w:rPr>
-                <w:sz w:val="18"/>
-                <w:szCs w:val="18"/>
-              </w:rPr>
-            </w:pPr>
-          </w:p>
-        </w:tc>
-        <w:tc>
-          <w:tcPr>
-            <w:tcW w:w="517" w:type="pct"/>
-            <w:vMerge w:val="continue"/>
-            <w:vAlign w:val="center"/>
-          </w:tcPr>
-          <w:p>
-            <w:pPr>
-              <w:pStyle w:val="436"/>
-              <w:spacing w:line="240" w:lineRule="exact"/>
-              <w:rPr>
-                <w:sz w:val="18"/>
-                <w:szCs w:val="18"/>
-              </w:rPr>
-            </w:pPr>
-          </w:p>
-        </w:tc>
-        <w:tc>
-          <w:tcPr>
-            <w:tcW w:w="304" w:type="pct"/>
-            <w:vAlign w:val="center"/>
-          </w:tcPr>
-          <w:p>
-            <w:pPr>
-              <w:pStyle w:val="436"/>
-              <w:spacing w:line="240" w:lineRule="exact"/>
-              <w:rPr>
-                <w:b/>
-                <w:bCs/>
-                <w:sz w:val="18"/>
-                <w:szCs w:val="18"/>
-              </w:rPr>
-            </w:pPr>
-            <w:r>
-              <w:rPr>
-                <w:rFonts w:hint="eastAsia"/>
-                <w:b/>
-                <w:bCs/>
-                <w:sz w:val="18"/>
-                <w:szCs w:val="18"/>
-              </w:rPr>
-              <w:t>数量</w:t>
-            </w:r>
-          </w:p>
-        </w:tc>
-        <w:tc>
-          <w:tcPr>
-            <w:tcW w:w="752" w:type="pct"/>
-            <w:vAlign w:val="center"/>
-          </w:tcPr>
-          <w:p>
-            <w:pPr>
-              <w:pStyle w:val="436"/>
-              <w:spacing w:line="240" w:lineRule="exact"/>
-              <w:rPr>
-                <w:b/>
-                <w:bCs/>
-                <w:sz w:val="18"/>
-                <w:szCs w:val="18"/>
-              </w:rPr>
-            </w:pPr>
-            <w:r>
-              <w:rPr>
-                <w:rFonts w:hint="eastAsia"/>
-                <w:b/>
-                <w:bCs/>
-                <w:sz w:val="18"/>
-                <w:szCs w:val="18"/>
-              </w:rPr>
-              <w:t>病害程度</w:t>
-            </w:r>
-          </w:p>
-        </w:tc>
-        <w:tc>
-          <w:tcPr>
-            <w:tcW w:w="304" w:type="pct"/>
-            <w:vAlign w:val="center"/>
-          </w:tcPr>
-          <w:p>
-            <w:pPr>
-              <w:pStyle w:val="436"/>
-              <w:spacing w:line="240" w:lineRule="exact"/>
-              <w:rPr>
-                <w:b/>
-                <w:bCs/>
-                <w:sz w:val="18"/>
-                <w:szCs w:val="18"/>
-              </w:rPr>
-            </w:pPr>
-            <w:r>
-              <w:rPr>
-                <w:rFonts w:hint="eastAsia"/>
-                <w:b/>
-                <w:bCs/>
-                <w:sz w:val="18"/>
-                <w:szCs w:val="18"/>
-              </w:rPr>
-              <w:t>数量</w:t>
-            </w:r>
-          </w:p>
-        </w:tc>
-        <w:tc>
-          <w:tcPr>
-            <w:tcW w:w="825" w:type="pct"/>
-            <w:vAlign w:val="center"/>
-          </w:tcPr>
-          <w:p>
-            <w:pPr>
-              <w:pStyle w:val="436"/>
-              <w:spacing w:line="240" w:lineRule="exact"/>
-              <w:rPr>
-                <w:b/>
-                <w:bCs/>
-                <w:sz w:val="18"/>
-                <w:szCs w:val="18"/>
-              </w:rPr>
-            </w:pPr>
-            <w:r>
-              <w:rPr>
-                <w:rFonts w:hint="eastAsia"/>
-                <w:b/>
-                <w:bCs/>
-                <w:sz w:val="18"/>
-                <w:szCs w:val="18"/>
-              </w:rPr>
-              <w:t>病害程度</w:t>
-            </w:r>
-          </w:p>
-        </w:tc>
-        <w:tc>
-          <w:tcPr>
-            <w:tcW w:w="570" w:type="pct"/>
-            <w:vMerge w:val="continue"/>
-            <w:vAlign w:val="center"/>
-          </w:tcPr>
-          <w:p>
-            <w:pPr>
-              <w:pStyle w:val="436"/>
-              <w:spacing w:line="240" w:lineRule="exact"/>
-              <w:rPr>
-                <w:sz w:val="18"/>
-                <w:szCs w:val="18"/>
-              </w:rPr>
-            </w:pPr>
-          </w:p>
-        </w:tc>
-        <w:tc>
-          <w:tcPr>
-            <w:tcW w:w="447" w:type="pct"/>
-            <w:vMerge w:val="continue"/>
-            <w:vAlign w:val="center"/>
-          </w:tcPr>
-          <w:p>
-            <w:pPr>
-              <w:pStyle w:val="436"/>
-              <w:spacing w:line="240" w:lineRule="exact"/>
-              <w:rPr>
-                <w:sz w:val="18"/>
-                <w:szCs w:val="18"/>
-              </w:rPr>
-            </w:pPr>
-          </w:p>
-        </w:tc>
-      </w:tr>
-      <w:tr>
-        <w:trPr>
-          <w:jc w:val="center"/>
-        </w:trPr>
-        <w:tc>
-          <w:tcPr>
-            <w:tcW w:w="473" w:type="pct"/>
-            <w:vMerge w:val="restart"/>
-            <w:vAlign w:val="center"/>
-          </w:tcPr>
-          <w:p>
-            <w:pPr>
-              <w:pStyle w:val="436"/>
-              <w:spacing w:line="240" w:lineRule="exact"/>
-              <w:rPr>
-                <w:sz w:val="18"/>
-                <w:szCs w:val="18"/>
-              </w:rPr>
-            </w:pPr>
-            <w:r>
-              <w:t>${桥梁名称}主桥左幅</w:t>
-            </w:r>
-          </w:p>
-        </w:tc>
-        <w:tc>
-          <w:tcPr>
-            <w:tcW w:w="199" w:type="pct"/>
-            <w:vMerge w:val="restart"/>
-            <w:vAlign w:val="center"/>
-          </w:tcPr>
-          <w:p>
-            <w:pPr>
-              <w:pStyle w:val="436"/>
-              <w:spacing w:line="240" w:lineRule="exact"/>
-              <w:rPr>
-                <w:sz w:val="18"/>
-                <w:szCs w:val="18"/>
-              </w:rPr>
-            </w:pPr>
-            <w:r>
-              <w:rPr>
-                <w:rFonts w:hint="eastAsia"/>
-                <w:sz w:val="18"/>
-                <w:szCs w:val="18"/>
-              </w:rPr>
-              <w:t>上部结构</w:t>
-            </w:r>
-          </w:p>
-        </w:tc>
-        <w:tc>
-          <w:tcPr>
-            <w:tcW w:w="231" w:type="pct"/>
-            <w:vMerge w:val="restart"/>
-            <w:vAlign w:val="center"/>
-          </w:tcPr>
-          <w:p>
-            <w:pPr>
-              <w:pStyle w:val="436"/>
-              <w:spacing w:line="240" w:lineRule="exact"/>
-              <w:rPr>
-                <w:sz w:val="18"/>
-                <w:szCs w:val="18"/>
-              </w:rPr>
-            </w:pPr>
-            <w:r>
-              <w:rPr>
-                <w:rFonts w:hint="eastAsia"/>
-                <w:sz w:val="18"/>
-                <w:szCs w:val="18"/>
-              </w:rPr>
-              <w:t>上部承重构件</w:t>
-            </w:r>
-          </w:p>
-        </w:tc>
-        <w:tc>
-          <w:tcPr>
-            <w:tcW w:w="375" w:type="pct"/>
-            <w:vMerge w:val="restart"/>
-            <w:vAlign w:val="center"/>
-          </w:tcPr>
-          <w:p>
-            <w:pPr>
-              <w:pStyle w:val="436"/>
-              <w:spacing w:line="240" w:lineRule="exact"/>
-              <w:rPr>
-                <w:color w:val="FF0000"/>
-                <w:sz w:val="18"/>
-                <w:szCs w:val="18"/>
-              </w:rPr>
-            </w:pPr>
-            <w:r>
-              <w:rPr>
-                <w:rFonts w:hint="eastAsia"/>
-                <w:color w:val="FF0000"/>
-                <w:sz w:val="18"/>
-                <w:szCs w:val="18"/>
-              </w:rPr>
-              <w:t>腹板</w:t>
-            </w:r>
-          </w:p>
-        </w:tc>
-        <w:tc>
-          <w:tcPr>
-            <w:tcW w:w="517" w:type="pct"/>
-            <w:vAlign w:val="center"/>
-          </w:tcPr>
-          <w:p>
-            <w:pPr>
-              <w:pStyle w:val="436"/>
-              <w:spacing w:line="240" w:lineRule="exact"/>
-              <w:rPr>
-                <w:color w:val="FF0000"/>
-                <w:sz w:val="18"/>
-                <w:szCs w:val="18"/>
-              </w:rPr>
-            </w:pPr>
-            <w:r>
-              <w:rPr>
-                <w:rFonts w:hint="eastAsia"/>
-                <w:color w:val="FF0000"/>
-                <w:sz w:val="18"/>
-                <w:szCs w:val="18"/>
-              </w:rPr>
-              <w:t>支点附近斜向裂缝</w:t>
-            </w:r>
-          </w:p>
-        </w:tc>
-        <w:tc>
-          <w:tcPr>
-            <w:tcW w:w="304" w:type="pct"/>
-            <w:vAlign w:val="center"/>
-          </w:tcPr>
-          <w:p>
-            <w:pPr>
-              <w:pStyle w:val="436"/>
-              <w:spacing w:line="240" w:lineRule="exact"/>
-              <w:rPr>
-                <w:color w:val="FF0000"/>
-                <w:sz w:val="18"/>
-                <w:szCs w:val="18"/>
-              </w:rPr>
-            </w:pPr>
-            <w:r>
-              <w:rPr>
-                <w:rFonts w:hint="eastAsia"/>
-                <w:color w:val="FF0000"/>
-                <w:sz w:val="18"/>
-                <w:szCs w:val="18"/>
-              </w:rPr>
-              <w:t>2</w:t>
-            </w:r>
-          </w:p>
-        </w:tc>
-        <w:tc>
-          <w:tcPr>
-            <w:tcW w:w="752" w:type="pct"/>
-            <w:vAlign w:val="center"/>
-          </w:tcPr>
-          <w:p>
-            <w:pPr>
-              <w:pStyle w:val="436"/>
-              <w:spacing w:line="240" w:lineRule="exact"/>
-              <w:rPr>
-                <w:color w:val="FF0000"/>
-                <w:sz w:val="18"/>
-                <w:szCs w:val="18"/>
-              </w:rPr>
-            </w:pPr>
-            <w:r>
-              <w:rPr>
-                <w:rFonts w:hint="eastAsia"/>
-                <w:color w:val="FF0000"/>
-                <w:sz w:val="18"/>
-                <w:szCs w:val="18"/>
-              </w:rPr>
-              <w:t>长度6.5m，宽度0.10～0.12mm</w:t>
-            </w:r>
-          </w:p>
-        </w:tc>
-        <w:tc>
-          <w:tcPr>
-            <w:tcW w:w="304" w:type="pct"/>
-            <w:vAlign w:val="center"/>
-          </w:tcPr>
-          <w:p>
-            <w:pPr>
-              <w:pStyle w:val="436"/>
-              <w:spacing w:line="240" w:lineRule="exact"/>
-              <w:rPr>
-                <w:color w:val="FF0000"/>
-                <w:sz w:val="18"/>
-                <w:szCs w:val="18"/>
-              </w:rPr>
-            </w:pPr>
-            <w:r>
-              <w:rPr>
-                <w:rFonts w:hint="eastAsia"/>
-                <w:color w:val="FF0000"/>
-                <w:sz w:val="18"/>
-                <w:szCs w:val="18"/>
-              </w:rPr>
-              <w:t>4</w:t>
-            </w:r>
-          </w:p>
-        </w:tc>
-        <w:tc>
-          <w:tcPr>
-            <w:tcW w:w="825" w:type="pct"/>
-            <w:vAlign w:val="center"/>
-          </w:tcPr>
-          <w:p>
-            <w:pPr>
-              <w:pStyle w:val="436"/>
-              <w:spacing w:line="240" w:lineRule="exact"/>
-              <w:rPr>
-                <w:color w:val="FF0000"/>
-                <w:sz w:val="18"/>
-                <w:szCs w:val="18"/>
-              </w:rPr>
-            </w:pPr>
-            <w:r>
-              <w:rPr>
-                <w:rFonts w:hint="eastAsia"/>
-                <w:color w:val="FF0000"/>
-                <w:sz w:val="18"/>
-                <w:szCs w:val="18"/>
-              </w:rPr>
-              <w:t>长度16.5m，宽度0.10～0.14mm</w:t>
-            </w:r>
-          </w:p>
-        </w:tc>
-        <w:tc>
-          <w:tcPr>
-            <w:tcW w:w="570" w:type="pct"/>
-            <w:vAlign w:val="center"/>
-          </w:tcPr>
-          <w:p>
-            <w:pPr>
-              <w:pStyle w:val="436"/>
-              <w:spacing w:line="240" w:lineRule="exact"/>
-              <w:rPr>
-                <w:color w:val="FF0000"/>
-                <w:sz w:val="18"/>
-                <w:szCs w:val="18"/>
-              </w:rPr>
-            </w:pPr>
-            <w:r>
-              <w:rPr>
-                <w:rFonts w:hint="eastAsia"/>
-                <w:color w:val="FF0000"/>
-                <w:sz w:val="18"/>
-                <w:szCs w:val="18"/>
-              </w:rPr>
-              <w:t>已修补1条，数量新增3条，长度新增10m，最大宽度增加0.02mm，</w:t>
-            </w:r>
-          </w:p>
-        </w:tc>
-        <w:tc>
-          <w:tcPr>
-            <w:tcW w:w="447" w:type="pct"/>
-            <w:vAlign w:val="center"/>
-          </w:tcPr>
-          <w:p>
-            <w:pPr>
-              <w:pStyle w:val="436"/>
-              <w:spacing w:line="240" w:lineRule="exact"/>
-              <w:rPr>
-                <w:color w:val="FF0000"/>
-                <w:sz w:val="18"/>
-                <w:szCs w:val="18"/>
-              </w:rPr>
-            </w:pPr>
-          </w:p>
-        </w:tc>
-      </w:tr>
-      <w:tr>
-        <w:trPr>
-          <w:jc w:val="center"/>
-        </w:trPr>
-        <w:tc>
-          <w:tcPr>
-            <w:tcW w:w="473" w:type="pct"/>
-            <w:vMerge w:val="continue"/>
-            <w:vAlign w:val="center"/>
-          </w:tcPr>
-          <w:p>
-            <w:pPr>
-              <w:pStyle w:val="436"/>
-              <w:spacing w:line="240" w:lineRule="exact"/>
-              <w:rPr>
-                <w:sz w:val="18"/>
-                <w:szCs w:val="18"/>
-              </w:rPr>
-            </w:pPr>
-          </w:p>
-        </w:tc>
-        <w:tc>
-          <w:tcPr>
-            <w:tcW w:w="199" w:type="pct"/>
-            <w:vMerge w:val="continue"/>
-            <w:vAlign w:val="center"/>
-          </w:tcPr>
-          <w:p>
-            <w:pPr>
-              <w:pStyle w:val="436"/>
-              <w:spacing w:line="240" w:lineRule="exact"/>
-              <w:rPr>
-                <w:sz w:val="18"/>
-                <w:szCs w:val="18"/>
-              </w:rPr>
-            </w:pPr>
-          </w:p>
-        </w:tc>
-        <w:tc>
-          <w:tcPr>
-            <w:tcW w:w="231" w:type="pct"/>
-            <w:vMerge w:val="continue"/>
-            <w:vAlign w:val="center"/>
-          </w:tcPr>
-          <w:p>
-            <w:pPr>
-              <w:pStyle w:val="436"/>
-              <w:spacing w:line="240" w:lineRule="exact"/>
-              <w:rPr>
-                <w:sz w:val="18"/>
-                <w:szCs w:val="18"/>
-              </w:rPr>
-            </w:pPr>
-          </w:p>
-        </w:tc>
-        <w:tc>
-          <w:tcPr>
-            <w:tcW w:w="375" w:type="pct"/>
-            <w:vMerge w:val="continue"/>
-            <w:vAlign w:val="center"/>
-          </w:tcPr>
-          <w:p>
-            <w:pPr>
-              <w:pStyle w:val="436"/>
-              <w:spacing w:line="240" w:lineRule="exact"/>
-              <w:rPr>
-                <w:color w:val="FF0000"/>
-                <w:sz w:val="18"/>
-                <w:szCs w:val="18"/>
-              </w:rPr>
-            </w:pPr>
-          </w:p>
-        </w:tc>
-        <w:tc>
-          <w:tcPr>
-            <w:tcW w:w="517" w:type="pct"/>
-            <w:vAlign w:val="center"/>
-          </w:tcPr>
-          <w:p>
-            <w:pPr>
-              <w:pStyle w:val="436"/>
-              <w:spacing w:line="240" w:lineRule="exact"/>
-              <w:rPr>
-                <w:color w:val="FF0000"/>
-                <w:sz w:val="18"/>
-                <w:szCs w:val="18"/>
-              </w:rPr>
-            </w:pPr>
-            <w:r>
-              <w:rPr>
-                <w:rFonts w:hint="eastAsia"/>
-                <w:color w:val="FF0000"/>
-                <w:sz w:val="18"/>
-                <w:szCs w:val="18"/>
-              </w:rPr>
-              <w:t>跨中竖向裂缝</w:t>
-            </w:r>
-          </w:p>
-        </w:tc>
-        <w:tc>
-          <w:tcPr>
-            <w:tcW w:w="304" w:type="pct"/>
-            <w:vAlign w:val="center"/>
-          </w:tcPr>
-          <w:p>
-            <w:pPr>
-              <w:pStyle w:val="436"/>
-              <w:spacing w:line="240" w:lineRule="exact"/>
-              <w:rPr>
-                <w:color w:val="FF0000"/>
-                <w:sz w:val="18"/>
-                <w:szCs w:val="18"/>
-              </w:rPr>
-            </w:pPr>
-            <w:r>
-              <w:rPr>
-                <w:rFonts w:hint="eastAsia"/>
-                <w:color w:val="FF0000"/>
-                <w:sz w:val="18"/>
-                <w:szCs w:val="18"/>
-              </w:rPr>
-              <w:t>2</w:t>
-            </w:r>
-          </w:p>
-        </w:tc>
-        <w:tc>
-          <w:tcPr>
-            <w:tcW w:w="752" w:type="pct"/>
-            <w:vAlign w:val="center"/>
-          </w:tcPr>
-          <w:p>
-            <w:pPr>
-              <w:pStyle w:val="436"/>
-              <w:spacing w:line="240" w:lineRule="exact"/>
-              <w:rPr>
-                <w:color w:val="FF0000"/>
-                <w:sz w:val="18"/>
-                <w:szCs w:val="18"/>
-              </w:rPr>
-            </w:pPr>
-            <w:r>
-              <w:rPr>
-                <w:color w:val="FF0000"/>
-                <w:sz w:val="18"/>
-                <w:szCs w:val="18"/>
-              </w:rPr>
-              <w:t>…</w:t>
-            </w:r>
-          </w:p>
-        </w:tc>
-        <w:tc>
-          <w:tcPr>
-            <w:tcW w:w="304" w:type="pct"/>
-            <w:vAlign w:val="center"/>
-          </w:tcPr>
-          <w:p>
-            <w:pPr>
-              <w:pStyle w:val="436"/>
-              <w:spacing w:line="240" w:lineRule="exact"/>
-              <w:rPr>
-                <w:color w:val="FF0000"/>
-                <w:sz w:val="18"/>
-                <w:szCs w:val="18"/>
-              </w:rPr>
-            </w:pPr>
-            <w:r>
-              <w:rPr>
-                <w:color w:val="FF0000"/>
-                <w:sz w:val="18"/>
-                <w:szCs w:val="18"/>
-              </w:rPr>
-              <w:t>…</w:t>
-            </w:r>
-          </w:p>
-        </w:tc>
-        <w:tc>
-          <w:tcPr>
-            <w:tcW w:w="825" w:type="pct"/>
-            <w:vAlign w:val="center"/>
-          </w:tcPr>
-          <w:p>
-            <w:pPr>
-              <w:pStyle w:val="436"/>
-              <w:spacing w:line="240" w:lineRule="exact"/>
-              <w:rPr>
-                <w:color w:val="FF0000"/>
-                <w:sz w:val="18"/>
-                <w:szCs w:val="18"/>
-              </w:rPr>
-            </w:pPr>
-            <w:r>
-              <w:rPr>
-                <w:color w:val="FF0000"/>
-                <w:sz w:val="18"/>
-                <w:szCs w:val="18"/>
-              </w:rPr>
-              <w:t>…</w:t>
-            </w:r>
-          </w:p>
-        </w:tc>
-        <w:tc>
-          <w:tcPr>
-            <w:tcW w:w="570" w:type="pct"/>
-            <w:vAlign w:val="center"/>
-          </w:tcPr>
-          <w:p>
-            <w:pPr>
-              <w:pStyle w:val="436"/>
-              <w:spacing w:line="240" w:lineRule="exact"/>
-              <w:rPr>
-                <w:color w:val="FF0000"/>
-                <w:sz w:val="18"/>
-                <w:szCs w:val="18"/>
-              </w:rPr>
-            </w:pPr>
-            <w:r>
-              <w:rPr>
-                <w:color w:val="FF0000"/>
-                <w:sz w:val="18"/>
-                <w:szCs w:val="18"/>
-              </w:rPr>
-              <w:t>…</w:t>
-            </w:r>
-          </w:p>
-        </w:tc>
-        <w:tc>
-          <w:tcPr>
-            <w:tcW w:w="447" w:type="pct"/>
-            <w:vAlign w:val="center"/>
-          </w:tcPr>
-          <w:p>
-            <w:pPr>
-              <w:pStyle w:val="436"/>
-              <w:spacing w:line="240" w:lineRule="exact"/>
-              <w:rPr>
-                <w:color w:val="FF0000"/>
-                <w:sz w:val="18"/>
-                <w:szCs w:val="18"/>
-              </w:rPr>
-            </w:pPr>
-            <w:r>
-              <w:rPr>
-                <w:color w:val="FF0000"/>
-                <w:sz w:val="18"/>
-                <w:szCs w:val="18"/>
-              </w:rPr>
-              <w:t>…</w:t>
-            </w:r>
-          </w:p>
-        </w:tc>
-      </w:tr>
-      <w:tr>
-        <w:trPr>
-          <w:jc w:val="center"/>
-        </w:trPr>
-        <w:tc>
-          <w:tcPr>
-            <w:tcW w:w="473" w:type="pct"/>
-            <w:vMerge w:val="continue"/>
-            <w:vAlign w:val="center"/>
-          </w:tcPr>
-          <w:p>
-            <w:pPr>
-              <w:pStyle w:val="436"/>
-              <w:spacing w:line="240" w:lineRule="exact"/>
-              <w:rPr>
-                <w:sz w:val="18"/>
-                <w:szCs w:val="18"/>
-              </w:rPr>
-            </w:pPr>
-          </w:p>
-        </w:tc>
-        <w:tc>
-          <w:tcPr>
-            <w:tcW w:w="199" w:type="pct"/>
-            <w:vMerge w:val="continue"/>
-            <w:vAlign w:val="center"/>
-          </w:tcPr>
-          <w:p>
-            <w:pPr>
-              <w:pStyle w:val="436"/>
-              <w:spacing w:line="240" w:lineRule="exact"/>
-              <w:rPr>
-                <w:sz w:val="18"/>
-                <w:szCs w:val="18"/>
-              </w:rPr>
-            </w:pPr>
-          </w:p>
-        </w:tc>
-        <w:tc>
-          <w:tcPr>
-            <w:tcW w:w="231" w:type="pct"/>
-            <w:vMerge w:val="continue"/>
-            <w:vAlign w:val="center"/>
-          </w:tcPr>
-          <w:p>
-            <w:pPr>
-              <w:pStyle w:val="436"/>
-              <w:spacing w:line="240" w:lineRule="exact"/>
-              <w:rPr>
-                <w:sz w:val="18"/>
-                <w:szCs w:val="18"/>
-              </w:rPr>
-            </w:pPr>
-          </w:p>
-        </w:tc>
-        <w:tc>
-          <w:tcPr>
-            <w:tcW w:w="375" w:type="pct"/>
-            <w:vAlign w:val="center"/>
-          </w:tcPr>
-          <w:p>
-            <w:pPr>
-              <w:pStyle w:val="436"/>
-              <w:spacing w:line="240" w:lineRule="exact"/>
-              <w:rPr>
-                <w:color w:val="FF0000"/>
-                <w:sz w:val="18"/>
-                <w:szCs w:val="18"/>
-              </w:rPr>
-            </w:pPr>
-            <w:r>
-              <w:rPr>
-                <w:rFonts w:hint="eastAsia"/>
-                <w:color w:val="FF0000"/>
-                <w:sz w:val="18"/>
-                <w:szCs w:val="18"/>
-              </w:rPr>
-              <w:t>底板</w:t>
-            </w:r>
-          </w:p>
-        </w:tc>
-        <w:tc>
-          <w:tcPr>
-            <w:tcW w:w="517" w:type="pct"/>
-            <w:vAlign w:val="center"/>
-          </w:tcPr>
-          <w:p>
-            <w:pPr>
-              <w:pStyle w:val="436"/>
-              <w:spacing w:line="240" w:lineRule="exact"/>
-              <w:rPr>
-                <w:color w:val="FF0000"/>
-                <w:sz w:val="18"/>
-                <w:szCs w:val="18"/>
-              </w:rPr>
-            </w:pPr>
-            <w:r>
-              <w:rPr>
-                <w:rFonts w:hint="eastAsia"/>
-                <w:color w:val="FF0000"/>
-                <w:sz w:val="18"/>
-                <w:szCs w:val="18"/>
-              </w:rPr>
-              <w:t>跨中横向裂缝</w:t>
-            </w:r>
-          </w:p>
-        </w:tc>
-        <w:tc>
-          <w:tcPr>
-            <w:tcW w:w="304" w:type="pct"/>
-            <w:vAlign w:val="center"/>
-          </w:tcPr>
-          <w:p>
-            <w:pPr>
-              <w:pStyle w:val="436"/>
-              <w:spacing w:line="240" w:lineRule="exact"/>
-              <w:rPr>
-                <w:color w:val="FF0000"/>
-                <w:sz w:val="18"/>
-                <w:szCs w:val="18"/>
-              </w:rPr>
-            </w:pPr>
-            <w:r>
-              <w:rPr>
-                <w:rFonts w:hint="eastAsia"/>
-                <w:color w:val="FF0000"/>
-                <w:sz w:val="18"/>
-                <w:szCs w:val="18"/>
-              </w:rPr>
-              <w:t>2</w:t>
-            </w:r>
-          </w:p>
-        </w:tc>
-        <w:tc>
-          <w:tcPr>
-            <w:tcW w:w="752" w:type="pct"/>
-            <w:vAlign w:val="center"/>
-          </w:tcPr>
-          <w:p>
-            <w:pPr>
-              <w:pStyle w:val="436"/>
-              <w:spacing w:line="240" w:lineRule="exact"/>
-              <w:rPr>
-                <w:color w:val="FF0000"/>
-                <w:sz w:val="18"/>
-                <w:szCs w:val="18"/>
-              </w:rPr>
-            </w:pPr>
-            <w:r>
-              <w:rPr>
-                <w:color w:val="FF0000"/>
-                <w:sz w:val="18"/>
-                <w:szCs w:val="18"/>
-              </w:rPr>
-              <w:t>…</w:t>
-            </w:r>
-          </w:p>
-        </w:tc>
-        <w:tc>
-          <w:tcPr>
-            <w:tcW w:w="304" w:type="pct"/>
-            <w:vAlign w:val="center"/>
-          </w:tcPr>
-          <w:p>
-            <w:pPr>
-              <w:pStyle w:val="436"/>
-              <w:spacing w:line="240" w:lineRule="exact"/>
-              <w:rPr>
-                <w:color w:val="FF0000"/>
-                <w:sz w:val="18"/>
-                <w:szCs w:val="18"/>
-              </w:rPr>
-            </w:pPr>
-            <w:r>
-              <w:rPr>
-                <w:color w:val="FF0000"/>
-                <w:sz w:val="18"/>
-                <w:szCs w:val="18"/>
-              </w:rPr>
-              <w:t>…</w:t>
-            </w:r>
-          </w:p>
-        </w:tc>
-        <w:tc>
-          <w:tcPr>
-            <w:tcW w:w="825" w:type="pct"/>
-            <w:vAlign w:val="center"/>
-          </w:tcPr>
-          <w:p>
-            <w:pPr>
-              <w:pStyle w:val="436"/>
-              <w:spacing w:line="240" w:lineRule="exact"/>
-              <w:rPr>
-                <w:color w:val="FF0000"/>
-                <w:sz w:val="18"/>
-                <w:szCs w:val="18"/>
-              </w:rPr>
-            </w:pPr>
-            <w:r>
-              <w:rPr>
-                <w:color w:val="FF0000"/>
-                <w:sz w:val="18"/>
-                <w:szCs w:val="18"/>
-              </w:rPr>
-              <w:t>…</w:t>
-            </w:r>
-          </w:p>
-        </w:tc>
-        <w:tc>
-          <w:tcPr>
-            <w:tcW w:w="570" w:type="pct"/>
-            <w:vAlign w:val="center"/>
-          </w:tcPr>
-          <w:p>
-            <w:pPr>
-              <w:pStyle w:val="436"/>
-              <w:spacing w:line="240" w:lineRule="exact"/>
-              <w:rPr>
-                <w:color w:val="FF0000"/>
-                <w:sz w:val="18"/>
-                <w:szCs w:val="18"/>
-              </w:rPr>
-            </w:pPr>
-            <w:r>
-              <w:rPr>
-                <w:color w:val="FF0000"/>
-                <w:sz w:val="18"/>
-                <w:szCs w:val="18"/>
-              </w:rPr>
-              <w:t>…</w:t>
-            </w:r>
-          </w:p>
-        </w:tc>
-        <w:tc>
-          <w:tcPr>
-            <w:tcW w:w="447" w:type="pct"/>
-            <w:vAlign w:val="center"/>
-          </w:tcPr>
-          <w:p>
-            <w:pPr>
-              <w:pStyle w:val="436"/>
-              <w:spacing w:line="240" w:lineRule="exact"/>
-              <w:rPr>
-                <w:color w:val="FF0000"/>
-                <w:sz w:val="18"/>
-                <w:szCs w:val="18"/>
-              </w:rPr>
-            </w:pPr>
-            <w:r>
-              <w:rPr>
-                <w:rFonts w:hint="eastAsia"/>
-                <w:color w:val="FF0000"/>
-                <w:sz w:val="18"/>
-                <w:szCs w:val="18"/>
-              </w:rPr>
-              <w:t>重点关注病害</w:t>
-            </w:r>
-          </w:p>
-        </w:tc>
-      </w:tr>
-      <w:tr>
-        <w:trPr>
-          <w:jc w:val="center"/>
-        </w:trPr>
-        <w:tc>
-          <w:tcPr>
-            <w:tcW w:w="473" w:type="pct"/>
-            <w:vMerge w:val="continue"/>
-            <w:vAlign w:val="center"/>
-          </w:tcPr>
-          <w:p>
-            <w:pPr>
-              <w:pStyle w:val="436"/>
-              <w:spacing w:line="240" w:lineRule="exact"/>
-              <w:rPr>
-                <w:sz w:val="18"/>
-                <w:szCs w:val="18"/>
-              </w:rPr>
-            </w:pPr>
-          </w:p>
-        </w:tc>
-        <w:tc>
-          <w:tcPr>
-            <w:tcW w:w="199" w:type="pct"/>
-            <w:vMerge w:val="continue"/>
-            <w:vAlign w:val="center"/>
-          </w:tcPr>
-          <w:p>
-            <w:pPr>
-              <w:pStyle w:val="436"/>
-              <w:spacing w:line="240" w:lineRule="exact"/>
-              <w:rPr>
-                <w:sz w:val="18"/>
-                <w:szCs w:val="18"/>
-              </w:rPr>
-            </w:pPr>
-          </w:p>
-        </w:tc>
-        <w:tc>
-          <w:tcPr>
-            <w:tcW w:w="231" w:type="pct"/>
-            <w:vMerge w:val="continue"/>
-            <w:vAlign w:val="center"/>
-          </w:tcPr>
-          <w:p>
-            <w:pPr>
-              <w:pStyle w:val="436"/>
-              <w:spacing w:line="240" w:lineRule="exact"/>
-              <w:rPr>
-                <w:sz w:val="18"/>
-                <w:szCs w:val="18"/>
-              </w:rPr>
-            </w:pPr>
-          </w:p>
-        </w:tc>
-        <w:tc>
-          <w:tcPr>
-            <w:tcW w:w="375" w:type="pct"/>
-            <w:vAlign w:val="center"/>
-          </w:tcPr>
-          <w:p>
-            <w:pPr>
-              <w:pStyle w:val="436"/>
-              <w:spacing w:line="240" w:lineRule="exact"/>
-              <w:rPr>
-                <w:color w:val="FF0000"/>
-                <w:sz w:val="18"/>
-                <w:szCs w:val="18"/>
-              </w:rPr>
-            </w:pPr>
-            <w:r>
-              <w:rPr>
-                <w:rFonts w:hint="eastAsia"/>
-                <w:color w:val="FF0000"/>
-                <w:sz w:val="18"/>
-                <w:szCs w:val="18"/>
-              </w:rPr>
-              <w:t>翼缘板</w:t>
-            </w:r>
-          </w:p>
-        </w:tc>
-        <w:tc>
-          <w:tcPr>
-            <w:tcW w:w="517" w:type="pct"/>
-            <w:vAlign w:val="center"/>
-          </w:tcPr>
-          <w:p>
-            <w:pPr>
-              <w:pStyle w:val="436"/>
-              <w:spacing w:line="240" w:lineRule="exact"/>
-              <w:rPr>
-                <w:color w:val="FF0000"/>
-                <w:sz w:val="18"/>
-                <w:szCs w:val="18"/>
-              </w:rPr>
-            </w:pPr>
-            <w:r>
-              <w:rPr>
-                <w:rFonts w:hint="eastAsia"/>
-                <w:color w:val="FF0000"/>
-                <w:sz w:val="18"/>
-                <w:szCs w:val="18"/>
-              </w:rPr>
-              <w:t>支点附近横向裂缝</w:t>
-            </w:r>
-          </w:p>
-        </w:tc>
-        <w:tc>
-          <w:tcPr>
-            <w:tcW w:w="304" w:type="pct"/>
-            <w:vAlign w:val="center"/>
-          </w:tcPr>
-          <w:p>
-            <w:pPr>
-              <w:pStyle w:val="436"/>
-              <w:spacing w:line="240" w:lineRule="exact"/>
-              <w:rPr>
-                <w:color w:val="FF0000"/>
-                <w:sz w:val="18"/>
-                <w:szCs w:val="18"/>
-              </w:rPr>
-            </w:pPr>
-            <w:r>
-              <w:rPr>
-                <w:rFonts w:hint="eastAsia"/>
-                <w:color w:val="FF0000"/>
-                <w:sz w:val="18"/>
-                <w:szCs w:val="18"/>
-              </w:rPr>
-              <w:t>2</w:t>
-            </w:r>
-          </w:p>
-        </w:tc>
-        <w:tc>
-          <w:tcPr>
-            <w:tcW w:w="752" w:type="pct"/>
-            <w:vAlign w:val="center"/>
-          </w:tcPr>
-          <w:p>
-            <w:pPr>
-              <w:pStyle w:val="436"/>
-              <w:spacing w:line="240" w:lineRule="exact"/>
-              <w:rPr>
-                <w:color w:val="FF0000"/>
-                <w:sz w:val="18"/>
-                <w:szCs w:val="18"/>
-              </w:rPr>
-            </w:pPr>
-            <w:r>
-              <w:rPr>
-                <w:color w:val="FF0000"/>
-                <w:sz w:val="18"/>
-                <w:szCs w:val="18"/>
-              </w:rPr>
-              <w:t>…</w:t>
-            </w:r>
-          </w:p>
-        </w:tc>
-        <w:tc>
-          <w:tcPr>
-            <w:tcW w:w="304" w:type="pct"/>
-            <w:vAlign w:val="center"/>
-          </w:tcPr>
-          <w:p>
-            <w:pPr>
-              <w:pStyle w:val="436"/>
-              <w:spacing w:line="240" w:lineRule="exact"/>
-              <w:rPr>
-                <w:color w:val="FF0000"/>
-                <w:sz w:val="18"/>
-                <w:szCs w:val="18"/>
-              </w:rPr>
-            </w:pPr>
-            <w:r>
-              <w:rPr>
-                <w:color w:val="FF0000"/>
-                <w:sz w:val="18"/>
-                <w:szCs w:val="18"/>
-              </w:rPr>
-              <w:t>…</w:t>
-            </w:r>
-          </w:p>
-        </w:tc>
-        <w:tc>
-          <w:tcPr>
-            <w:tcW w:w="825" w:type="pct"/>
-            <w:vAlign w:val="center"/>
-          </w:tcPr>
-          <w:p>
-            <w:pPr>
-              <w:pStyle w:val="436"/>
-              <w:spacing w:line="240" w:lineRule="exact"/>
-              <w:rPr>
-                <w:color w:val="FF0000"/>
-                <w:sz w:val="18"/>
-                <w:szCs w:val="18"/>
-              </w:rPr>
-            </w:pPr>
-            <w:r>
-              <w:rPr>
-                <w:color w:val="FF0000"/>
-                <w:sz w:val="18"/>
-                <w:szCs w:val="18"/>
-              </w:rPr>
-              <w:t>…</w:t>
-            </w:r>
-          </w:p>
-        </w:tc>
-        <w:tc>
-          <w:tcPr>
-            <w:tcW w:w="570" w:type="pct"/>
-            <w:vAlign w:val="center"/>
-          </w:tcPr>
-          <w:p>
-            <w:pPr>
-              <w:pStyle w:val="436"/>
-              <w:spacing w:line="240" w:lineRule="exact"/>
-              <w:rPr>
-                <w:color w:val="FF0000"/>
-                <w:sz w:val="18"/>
-                <w:szCs w:val="18"/>
-              </w:rPr>
-            </w:pPr>
-            <w:r>
-              <w:rPr>
-                <w:color w:val="FF0000"/>
-                <w:sz w:val="18"/>
-                <w:szCs w:val="18"/>
-              </w:rPr>
-              <w:t>…</w:t>
-            </w:r>
-          </w:p>
-        </w:tc>
-        <w:tc>
-          <w:tcPr>
-            <w:tcW w:w="447" w:type="pct"/>
-            <w:vAlign w:val="center"/>
-          </w:tcPr>
-          <w:p>
-            <w:pPr>
-              <w:pStyle w:val="436"/>
-              <w:spacing w:line="240" w:lineRule="exact"/>
-              <w:rPr>
-                <w:color w:val="FF0000"/>
-                <w:sz w:val="18"/>
-                <w:szCs w:val="18"/>
-              </w:rPr>
-            </w:pPr>
-            <w:r>
-              <w:rPr>
-                <w:color w:val="FF0000"/>
-                <w:sz w:val="18"/>
-                <w:szCs w:val="18"/>
-              </w:rPr>
-              <w:t>…</w:t>
-            </w:r>
-          </w:p>
-        </w:tc>
-      </w:tr>
-      <w:tr>
-        <w:trPr>
-          <w:jc w:val="center"/>
-        </w:trPr>
-        <w:tc>
-          <w:tcPr>
-            <w:tcW w:w="473" w:type="pct"/>
-            <w:vMerge w:val="continue"/>
-            <w:vAlign w:val="center"/>
-          </w:tcPr>
-          <w:p>
-            <w:pPr>
-              <w:pStyle w:val="436"/>
-              <w:spacing w:line="240" w:lineRule="exact"/>
-              <w:rPr>
-                <w:sz w:val="18"/>
-                <w:szCs w:val="18"/>
-              </w:rPr>
-            </w:pPr>
-          </w:p>
-        </w:tc>
-        <w:tc>
-          <w:tcPr>
-            <w:tcW w:w="199" w:type="pct"/>
-            <w:vMerge w:val="continue"/>
-            <w:vAlign w:val="center"/>
-          </w:tcPr>
-          <w:p>
-            <w:pPr>
-              <w:pStyle w:val="436"/>
-              <w:spacing w:line="240" w:lineRule="exact"/>
-              <w:rPr>
-                <w:sz w:val="18"/>
-                <w:szCs w:val="18"/>
-              </w:rPr>
-            </w:pPr>
-          </w:p>
-        </w:tc>
-        <w:tc>
-          <w:tcPr>
-            <w:tcW w:w="231" w:type="pct"/>
-            <w:vAlign w:val="center"/>
-          </w:tcPr>
-          <w:p>
-            <w:pPr>
-              <w:pStyle w:val="436"/>
-              <w:spacing w:line="240" w:lineRule="exact"/>
-              <w:rPr>
-                <w:sz w:val="18"/>
-                <w:szCs w:val="18"/>
-              </w:rPr>
-            </w:pPr>
-            <w:r>
-              <w:rPr>
-                <w:rFonts w:hint="eastAsia"/>
-                <w:sz w:val="18"/>
-                <w:szCs w:val="18"/>
-              </w:rPr>
-              <w:t>上部一般构件</w:t>
-            </w:r>
-          </w:p>
-        </w:tc>
-        <w:tc>
-          <w:tcPr>
-            <w:tcW w:w="375" w:type="pct"/>
-            <w:vAlign w:val="center"/>
-          </w:tcPr>
-          <w:p>
-            <w:pPr>
-              <w:pStyle w:val="436"/>
-              <w:spacing w:line="240" w:lineRule="exact"/>
-              <w:rPr>
-                <w:sz w:val="18"/>
-                <w:szCs w:val="18"/>
-              </w:rPr>
-            </w:pPr>
-          </w:p>
-        </w:tc>
-        <w:tc>
-          <w:tcPr>
-            <w:tcW w:w="517" w:type="pct"/>
-            <w:vAlign w:val="center"/>
-          </w:tcPr>
-          <w:p>
-            <w:pPr>
-              <w:pStyle w:val="436"/>
-              <w:spacing w:line="240" w:lineRule="exact"/>
-              <w:rPr>
-                <w:sz w:val="18"/>
-                <w:szCs w:val="18"/>
-              </w:rPr>
-            </w:pPr>
-          </w:p>
-        </w:tc>
-        <w:tc>
-          <w:tcPr>
-            <w:tcW w:w="304" w:type="pct"/>
-            <w:vAlign w:val="center"/>
-          </w:tcPr>
-          <w:p>
-            <w:pPr>
-              <w:pStyle w:val="436"/>
-              <w:spacing w:line="240" w:lineRule="exact"/>
-              <w:rPr>
-                <w:sz w:val="18"/>
-                <w:szCs w:val="18"/>
-              </w:rPr>
-            </w:pPr>
-          </w:p>
-        </w:tc>
-        <w:tc>
-          <w:tcPr>
-            <w:tcW w:w="752" w:type="pct"/>
-            <w:vAlign w:val="center"/>
-          </w:tcPr>
-          <w:p>
-            <w:pPr>
-              <w:pStyle w:val="436"/>
-              <w:spacing w:line="240" w:lineRule="exact"/>
-              <w:rPr>
-                <w:sz w:val="18"/>
-                <w:szCs w:val="18"/>
-              </w:rPr>
-            </w:pPr>
-          </w:p>
-        </w:tc>
-        <w:tc>
-          <w:tcPr>
-            <w:tcW w:w="304" w:type="pct"/>
-            <w:vAlign w:val="center"/>
-          </w:tcPr>
-          <w:p>
-            <w:pPr>
-              <w:pStyle w:val="436"/>
-              <w:spacing w:line="240" w:lineRule="exact"/>
-              <w:rPr>
-                <w:sz w:val="18"/>
-                <w:szCs w:val="18"/>
-              </w:rPr>
-            </w:pPr>
-          </w:p>
-        </w:tc>
-        <w:tc>
-          <w:tcPr>
-            <w:tcW w:w="825" w:type="pct"/>
-            <w:vAlign w:val="center"/>
-          </w:tcPr>
-          <w:p>
-            <w:pPr>
-              <w:pStyle w:val="436"/>
-              <w:spacing w:line="240" w:lineRule="exact"/>
-              <w:rPr>
-                <w:sz w:val="18"/>
-                <w:szCs w:val="18"/>
-              </w:rPr>
-            </w:pPr>
-          </w:p>
-        </w:tc>
-        <w:tc>
-          <w:tcPr>
-            <w:tcW w:w="570" w:type="pct"/>
-            <w:vAlign w:val="center"/>
-          </w:tcPr>
-          <w:p>
-            <w:pPr>
-              <w:pStyle w:val="436"/>
-              <w:spacing w:line="240" w:lineRule="exact"/>
-              <w:rPr>
-                <w:sz w:val="18"/>
-                <w:szCs w:val="18"/>
-              </w:rPr>
-            </w:pPr>
-          </w:p>
-        </w:tc>
-        <w:tc>
-          <w:tcPr>
-            <w:tcW w:w="447" w:type="pct"/>
-            <w:vAlign w:val="center"/>
-          </w:tcPr>
-          <w:p>
-            <w:pPr>
-              <w:pStyle w:val="436"/>
-              <w:spacing w:line="240" w:lineRule="exact"/>
-              <w:rPr>
-                <w:sz w:val="18"/>
-                <w:szCs w:val="18"/>
-              </w:rPr>
-            </w:pPr>
-          </w:p>
-        </w:tc>
-      </w:tr>
-      <w:tr>
-        <w:trPr>
-          <w:jc w:val="center"/>
-        </w:trPr>
-        <w:tc>
-          <w:tcPr>
-            <w:tcW w:w="473" w:type="pct"/>
-            <w:vMerge w:val="continue"/>
-            <w:vAlign w:val="center"/>
-          </w:tcPr>
-          <w:p>
-            <w:pPr>
-              <w:pStyle w:val="436"/>
-              <w:spacing w:line="240" w:lineRule="exact"/>
-              <w:rPr>
-                <w:sz w:val="18"/>
-                <w:szCs w:val="18"/>
-              </w:rPr>
-            </w:pPr>
-          </w:p>
-        </w:tc>
-        <w:tc>
-          <w:tcPr>
-            <w:tcW w:w="199" w:type="pct"/>
-            <w:vMerge w:val="continue"/>
-            <w:vAlign w:val="center"/>
-          </w:tcPr>
-          <w:p>
-            <w:pPr>
-              <w:pStyle w:val="436"/>
-              <w:spacing w:line="240" w:lineRule="exact"/>
-              <w:rPr>
-                <w:sz w:val="18"/>
-                <w:szCs w:val="18"/>
-              </w:rPr>
-            </w:pPr>
-          </w:p>
-        </w:tc>
-        <w:tc>
-          <w:tcPr>
-            <w:tcW w:w="231" w:type="pct"/>
-            <w:vAlign w:val="center"/>
-          </w:tcPr>
-          <w:p>
-            <w:pPr>
-              <w:pStyle w:val="436"/>
-              <w:spacing w:line="240" w:lineRule="exact"/>
-              <w:rPr>
-                <w:sz w:val="18"/>
-                <w:szCs w:val="18"/>
-              </w:rPr>
-            </w:pPr>
-            <w:r>
-              <w:rPr>
-                <w:rFonts w:hint="eastAsia"/>
-                <w:sz w:val="18"/>
-                <w:szCs w:val="18"/>
-              </w:rPr>
-              <w:t>支座</w:t>
-            </w:r>
-          </w:p>
-        </w:tc>
-        <w:tc>
-          <w:tcPr>
-            <w:tcW w:w="375" w:type="pct"/>
-            <w:vAlign w:val="center"/>
-          </w:tcPr>
-          <w:p>
-            <w:pPr>
-              <w:pStyle w:val="436"/>
-              <w:spacing w:line="240" w:lineRule="exact"/>
-              <w:rPr>
-                <w:sz w:val="18"/>
-                <w:szCs w:val="18"/>
-              </w:rPr>
-            </w:pPr>
-          </w:p>
-        </w:tc>
-        <w:tc>
-          <w:tcPr>
-            <w:tcW w:w="517" w:type="pct"/>
-            <w:vAlign w:val="center"/>
-          </w:tcPr>
-          <w:p>
-            <w:pPr>
-              <w:pStyle w:val="436"/>
-              <w:spacing w:line="240" w:lineRule="exact"/>
-              <w:rPr>
-                <w:sz w:val="18"/>
-                <w:szCs w:val="18"/>
-              </w:rPr>
-            </w:pPr>
-          </w:p>
-        </w:tc>
-        <w:tc>
-          <w:tcPr>
-            <w:tcW w:w="304" w:type="pct"/>
-            <w:vAlign w:val="center"/>
-          </w:tcPr>
-          <w:p>
-            <w:pPr>
-              <w:pStyle w:val="436"/>
-              <w:spacing w:line="240" w:lineRule="exact"/>
-              <w:rPr>
-                <w:sz w:val="18"/>
-                <w:szCs w:val="18"/>
-              </w:rPr>
-            </w:pPr>
-          </w:p>
-        </w:tc>
-        <w:tc>
-          <w:tcPr>
-            <w:tcW w:w="752" w:type="pct"/>
-            <w:vAlign w:val="center"/>
-          </w:tcPr>
-          <w:p>
-            <w:pPr>
-              <w:pStyle w:val="436"/>
-              <w:spacing w:line="240" w:lineRule="exact"/>
-              <w:rPr>
-                <w:sz w:val="18"/>
-                <w:szCs w:val="18"/>
-              </w:rPr>
-            </w:pPr>
-          </w:p>
-        </w:tc>
-        <w:tc>
-          <w:tcPr>
-            <w:tcW w:w="304" w:type="pct"/>
-            <w:vAlign w:val="center"/>
-          </w:tcPr>
-          <w:p>
-            <w:pPr>
-              <w:pStyle w:val="436"/>
-              <w:spacing w:line="240" w:lineRule="exact"/>
-              <w:rPr>
-                <w:sz w:val="18"/>
-                <w:szCs w:val="18"/>
-              </w:rPr>
-            </w:pPr>
-          </w:p>
-        </w:tc>
-        <w:tc>
-          <w:tcPr>
-            <w:tcW w:w="825" w:type="pct"/>
-            <w:vAlign w:val="center"/>
-          </w:tcPr>
-          <w:p>
-            <w:pPr>
-              <w:pStyle w:val="436"/>
-              <w:spacing w:line="240" w:lineRule="exact"/>
-              <w:rPr>
-                <w:sz w:val="18"/>
-                <w:szCs w:val="18"/>
-              </w:rPr>
-            </w:pPr>
-          </w:p>
-        </w:tc>
-        <w:tc>
-          <w:tcPr>
-            <w:tcW w:w="570" w:type="pct"/>
-            <w:vAlign w:val="center"/>
-          </w:tcPr>
-          <w:p>
-            <w:pPr>
-              <w:pStyle w:val="436"/>
-              <w:spacing w:line="240" w:lineRule="exact"/>
-              <w:rPr>
-                <w:sz w:val="18"/>
-                <w:szCs w:val="18"/>
-              </w:rPr>
-            </w:pPr>
-          </w:p>
-        </w:tc>
-        <w:tc>
-          <w:tcPr>
-            <w:tcW w:w="447" w:type="pct"/>
-            <w:vAlign w:val="center"/>
-          </w:tcPr>
-          <w:p>
-            <w:pPr>
-              <w:pStyle w:val="436"/>
-              <w:spacing w:line="240" w:lineRule="exact"/>
-              <w:rPr>
-                <w:sz w:val="18"/>
-                <w:szCs w:val="18"/>
-              </w:rPr>
-            </w:pPr>
-          </w:p>
-        </w:tc>
-      </w:tr>
-      <w:tr>
-        <w:trPr>
-          <w:jc w:val="center"/>
-        </w:trPr>
-        <w:tc>
-          <w:tcPr>
-            <w:tcW w:w="473" w:type="pct"/>
-            <w:vMerge w:val="continue"/>
-            <w:vAlign w:val="center"/>
-          </w:tcPr>
-          <w:p>
-            <w:pPr>
-              <w:pStyle w:val="436"/>
-              <w:spacing w:line="240" w:lineRule="exact"/>
-              <w:rPr>
-                <w:sz w:val="18"/>
-                <w:szCs w:val="18"/>
-              </w:rPr>
-            </w:pPr>
-          </w:p>
-        </w:tc>
-        <w:tc>
-          <w:tcPr>
-            <w:tcW w:w="199" w:type="pct"/>
-            <w:vMerge w:val="restart"/>
-            <w:vAlign w:val="center"/>
-          </w:tcPr>
-          <w:p>
-            <w:pPr>
-              <w:pStyle w:val="436"/>
-              <w:spacing w:line="240" w:lineRule="exact"/>
-              <w:rPr>
-                <w:sz w:val="18"/>
-                <w:szCs w:val="18"/>
-              </w:rPr>
-            </w:pPr>
-            <w:r>
-              <w:rPr>
-                <w:rFonts w:hint="eastAsia"/>
-                <w:sz w:val="18"/>
-                <w:szCs w:val="18"/>
-              </w:rPr>
-              <w:t>下部结构</w:t>
-            </w:r>
-          </w:p>
-        </w:tc>
-        <w:tc>
-          <w:tcPr>
-            <w:tcW w:w="231" w:type="pct"/>
-            <w:vAlign w:val="center"/>
-          </w:tcPr>
-          <w:p>
-            <w:pPr>
-              <w:pStyle w:val="436"/>
-              <w:spacing w:line="240" w:lineRule="exact"/>
-              <w:rPr>
-                <w:sz w:val="18"/>
-                <w:szCs w:val="18"/>
-              </w:rPr>
-            </w:pPr>
-            <w:r>
-              <w:rPr>
-                <w:rFonts w:hint="eastAsia"/>
-                <w:sz w:val="18"/>
-                <w:szCs w:val="18"/>
-              </w:rPr>
-              <w:t>桥台</w:t>
-            </w:r>
-          </w:p>
-        </w:tc>
-        <w:tc>
-          <w:tcPr>
-            <w:tcW w:w="375" w:type="pct"/>
-            <w:vAlign w:val="center"/>
-          </w:tcPr>
-          <w:p>
-            <w:pPr>
-              <w:pStyle w:val="436"/>
-              <w:spacing w:line="240" w:lineRule="exact"/>
-              <w:rPr>
-                <w:sz w:val="18"/>
-                <w:szCs w:val="18"/>
-              </w:rPr>
-            </w:pPr>
-          </w:p>
-        </w:tc>
-        <w:tc>
-          <w:tcPr>
-            <w:tcW w:w="517" w:type="pct"/>
-            <w:vAlign w:val="center"/>
-          </w:tcPr>
-          <w:p>
-            <w:pPr>
-              <w:pStyle w:val="436"/>
-              <w:spacing w:line="240" w:lineRule="exact"/>
-              <w:rPr>
-                <w:sz w:val="18"/>
-                <w:szCs w:val="18"/>
-              </w:rPr>
-            </w:pPr>
-          </w:p>
-        </w:tc>
-        <w:tc>
-          <w:tcPr>
-            <w:tcW w:w="304" w:type="pct"/>
-            <w:vAlign w:val="center"/>
-          </w:tcPr>
-          <w:p>
-            <w:pPr>
-              <w:pStyle w:val="436"/>
-              <w:spacing w:line="240" w:lineRule="exact"/>
-              <w:rPr>
-                <w:sz w:val="18"/>
-                <w:szCs w:val="18"/>
-              </w:rPr>
-            </w:pPr>
-          </w:p>
-        </w:tc>
-        <w:tc>
-          <w:tcPr>
-            <w:tcW w:w="752" w:type="pct"/>
-            <w:vAlign w:val="center"/>
-          </w:tcPr>
-          <w:p>
-            <w:pPr>
-              <w:pStyle w:val="436"/>
-              <w:spacing w:line="240" w:lineRule="exact"/>
-              <w:rPr>
-                <w:sz w:val="18"/>
-                <w:szCs w:val="18"/>
-              </w:rPr>
-            </w:pPr>
-          </w:p>
-        </w:tc>
-        <w:tc>
-          <w:tcPr>
-            <w:tcW w:w="304" w:type="pct"/>
-            <w:vAlign w:val="center"/>
-          </w:tcPr>
-          <w:p>
-            <w:pPr>
-              <w:pStyle w:val="436"/>
-              <w:spacing w:line="240" w:lineRule="exact"/>
-              <w:rPr>
-                <w:sz w:val="18"/>
-                <w:szCs w:val="18"/>
-              </w:rPr>
-            </w:pPr>
-          </w:p>
-        </w:tc>
-        <w:tc>
-          <w:tcPr>
-            <w:tcW w:w="825" w:type="pct"/>
-            <w:vAlign w:val="center"/>
-          </w:tcPr>
-          <w:p>
-            <w:pPr>
-              <w:pStyle w:val="436"/>
-              <w:spacing w:line="240" w:lineRule="exact"/>
-              <w:rPr>
-                <w:sz w:val="18"/>
-                <w:szCs w:val="18"/>
-              </w:rPr>
-            </w:pPr>
-          </w:p>
-        </w:tc>
-        <w:tc>
-          <w:tcPr>
-            <w:tcW w:w="570" w:type="pct"/>
-            <w:vAlign w:val="center"/>
-          </w:tcPr>
-          <w:p>
-            <w:pPr>
-              <w:pStyle w:val="436"/>
-              <w:spacing w:line="240" w:lineRule="exact"/>
-              <w:rPr>
-                <w:sz w:val="18"/>
-                <w:szCs w:val="18"/>
-              </w:rPr>
-            </w:pPr>
-          </w:p>
-        </w:tc>
-        <w:tc>
-          <w:tcPr>
-            <w:tcW w:w="447" w:type="pct"/>
-            <w:vAlign w:val="center"/>
-          </w:tcPr>
-          <w:p>
-            <w:pPr>
-              <w:pStyle w:val="436"/>
-              <w:spacing w:line="240" w:lineRule="exact"/>
-              <w:rPr>
-                <w:sz w:val="18"/>
-                <w:szCs w:val="18"/>
-              </w:rPr>
-            </w:pPr>
-          </w:p>
-        </w:tc>
-      </w:tr>
-      <w:tr>
-        <w:trPr>
-          <w:jc w:val="center"/>
-        </w:trPr>
-        <w:tc>
-          <w:tcPr>
-            <w:tcW w:w="473" w:type="pct"/>
-            <w:vMerge w:val="continue"/>
-            <w:vAlign w:val="center"/>
-          </w:tcPr>
-          <w:p>
-            <w:pPr>
-              <w:pStyle w:val="436"/>
-              <w:spacing w:line="240" w:lineRule="exact"/>
-              <w:rPr>
-                <w:sz w:val="18"/>
-                <w:szCs w:val="18"/>
-              </w:rPr>
-            </w:pPr>
-          </w:p>
-        </w:tc>
-        <w:tc>
-          <w:tcPr>
-            <w:tcW w:w="199" w:type="pct"/>
-            <w:vMerge w:val="continue"/>
-            <w:vAlign w:val="center"/>
-          </w:tcPr>
-          <w:p>
-            <w:pPr>
-              <w:pStyle w:val="436"/>
-              <w:spacing w:line="240" w:lineRule="exact"/>
-              <w:rPr>
-                <w:sz w:val="18"/>
-                <w:szCs w:val="18"/>
-              </w:rPr>
-            </w:pPr>
-          </w:p>
-        </w:tc>
-        <w:tc>
-          <w:tcPr>
-            <w:tcW w:w="231" w:type="pct"/>
-            <w:vAlign w:val="center"/>
-          </w:tcPr>
-          <w:p>
-            <w:pPr>
-              <w:pStyle w:val="436"/>
-              <w:spacing w:line="240" w:lineRule="exact"/>
-              <w:rPr>
-                <w:sz w:val="18"/>
-                <w:szCs w:val="18"/>
-              </w:rPr>
-            </w:pPr>
-            <w:r>
-              <w:rPr>
-                <w:rFonts w:hint="eastAsia"/>
-                <w:sz w:val="18"/>
-                <w:szCs w:val="18"/>
-              </w:rPr>
-              <w:t>桥墩</w:t>
-            </w:r>
-          </w:p>
-        </w:tc>
-        <w:tc>
-          <w:tcPr>
-            <w:tcW w:w="375" w:type="pct"/>
-            <w:vAlign w:val="center"/>
-          </w:tcPr>
-          <w:p>
-            <w:pPr>
-              <w:pStyle w:val="436"/>
-              <w:spacing w:line="240" w:lineRule="exact"/>
-              <w:rPr>
-                <w:sz w:val="18"/>
-                <w:szCs w:val="18"/>
-              </w:rPr>
-            </w:pPr>
-          </w:p>
-        </w:tc>
-        <w:tc>
-          <w:tcPr>
-            <w:tcW w:w="517" w:type="pct"/>
-            <w:vAlign w:val="center"/>
-          </w:tcPr>
-          <w:p>
-            <w:pPr>
-              <w:pStyle w:val="436"/>
-              <w:spacing w:line="240" w:lineRule="exact"/>
-              <w:rPr>
-                <w:sz w:val="18"/>
-                <w:szCs w:val="18"/>
-              </w:rPr>
-            </w:pPr>
-          </w:p>
-        </w:tc>
-        <w:tc>
-          <w:tcPr>
-            <w:tcW w:w="304" w:type="pct"/>
-            <w:vAlign w:val="center"/>
-          </w:tcPr>
-          <w:p>
-            <w:pPr>
-              <w:pStyle w:val="436"/>
-              <w:spacing w:line="240" w:lineRule="exact"/>
-              <w:rPr>
-                <w:sz w:val="18"/>
-                <w:szCs w:val="18"/>
-              </w:rPr>
-            </w:pPr>
-          </w:p>
-        </w:tc>
-        <w:tc>
-          <w:tcPr>
-            <w:tcW w:w="752" w:type="pct"/>
-            <w:vAlign w:val="center"/>
-          </w:tcPr>
-          <w:p>
-            <w:pPr>
-              <w:pStyle w:val="436"/>
-              <w:spacing w:line="240" w:lineRule="exact"/>
-              <w:rPr>
-                <w:sz w:val="18"/>
-                <w:szCs w:val="18"/>
-              </w:rPr>
-            </w:pPr>
-          </w:p>
-        </w:tc>
-        <w:tc>
-          <w:tcPr>
-            <w:tcW w:w="304" w:type="pct"/>
-            <w:vAlign w:val="center"/>
-          </w:tcPr>
-          <w:p>
-            <w:pPr>
-              <w:pStyle w:val="436"/>
-              <w:spacing w:line="240" w:lineRule="exact"/>
-              <w:rPr>
-                <w:sz w:val="18"/>
-                <w:szCs w:val="18"/>
-              </w:rPr>
-            </w:pPr>
-          </w:p>
-        </w:tc>
-        <w:tc>
-          <w:tcPr>
-            <w:tcW w:w="825" w:type="pct"/>
-            <w:vAlign w:val="center"/>
-          </w:tcPr>
-          <w:p>
-            <w:pPr>
-              <w:pStyle w:val="436"/>
-              <w:spacing w:line="240" w:lineRule="exact"/>
-              <w:rPr>
-                <w:sz w:val="18"/>
-                <w:szCs w:val="18"/>
-              </w:rPr>
-            </w:pPr>
-          </w:p>
-        </w:tc>
-        <w:tc>
-          <w:tcPr>
-            <w:tcW w:w="570" w:type="pct"/>
-            <w:vAlign w:val="center"/>
-          </w:tcPr>
-          <w:p>
-            <w:pPr>
-              <w:pStyle w:val="436"/>
-              <w:spacing w:line="240" w:lineRule="exact"/>
-              <w:rPr>
-                <w:sz w:val="18"/>
-                <w:szCs w:val="18"/>
-              </w:rPr>
-            </w:pPr>
-          </w:p>
-        </w:tc>
-        <w:tc>
-          <w:tcPr>
-            <w:tcW w:w="447" w:type="pct"/>
-            <w:vAlign w:val="center"/>
-          </w:tcPr>
-          <w:p>
-            <w:pPr>
-              <w:pStyle w:val="436"/>
-              <w:spacing w:line="240" w:lineRule="exact"/>
-              <w:rPr>
-                <w:sz w:val="18"/>
-                <w:szCs w:val="18"/>
-              </w:rPr>
-            </w:pPr>
-          </w:p>
-        </w:tc>
-      </w:tr>
-      <w:tr>
-        <w:trPr>
-          <w:jc w:val="center"/>
-        </w:trPr>
-        <w:tc>
-          <w:tcPr>
-            <w:tcW w:w="473" w:type="pct"/>
-            <w:vMerge w:val="continue"/>
-            <w:vAlign w:val="center"/>
-          </w:tcPr>
-          <w:p>
-            <w:pPr>
-              <w:pStyle w:val="436"/>
-              <w:spacing w:line="240" w:lineRule="exact"/>
-              <w:rPr>
-                <w:sz w:val="18"/>
-                <w:szCs w:val="18"/>
-              </w:rPr>
-            </w:pPr>
-          </w:p>
-        </w:tc>
-        <w:tc>
-          <w:tcPr>
-            <w:tcW w:w="199" w:type="pct"/>
-            <w:vMerge w:val="continue"/>
-            <w:vAlign w:val="center"/>
-          </w:tcPr>
-          <w:p>
-            <w:pPr>
-              <w:pStyle w:val="436"/>
-              <w:spacing w:line="240" w:lineRule="exact"/>
-              <w:rPr>
-                <w:sz w:val="18"/>
-                <w:szCs w:val="18"/>
-              </w:rPr>
-            </w:pPr>
-          </w:p>
-        </w:tc>
-        <w:tc>
-          <w:tcPr>
-            <w:tcW w:w="231" w:type="pct"/>
-            <w:vAlign w:val="center"/>
-          </w:tcPr>
-          <w:p>
-            <w:pPr>
-              <w:pStyle w:val="436"/>
-              <w:spacing w:line="240" w:lineRule="exact"/>
-              <w:rPr>
-                <w:sz w:val="18"/>
-                <w:szCs w:val="18"/>
-              </w:rPr>
-            </w:pPr>
-            <w:r>
-              <w:rPr>
-                <w:rFonts w:hint="eastAsia"/>
-                <w:sz w:val="18"/>
-                <w:szCs w:val="18"/>
-              </w:rPr>
-              <w:t>墩台基础</w:t>
-            </w:r>
-          </w:p>
-        </w:tc>
-        <w:tc>
-          <w:tcPr>
-            <w:tcW w:w="375" w:type="pct"/>
-            <w:vAlign w:val="center"/>
-          </w:tcPr>
-          <w:p>
-            <w:pPr>
-              <w:pStyle w:val="436"/>
-              <w:spacing w:line="240" w:lineRule="exact"/>
-              <w:rPr>
-                <w:sz w:val="18"/>
-                <w:szCs w:val="18"/>
-              </w:rPr>
-            </w:pPr>
-          </w:p>
-        </w:tc>
-        <w:tc>
-          <w:tcPr>
-            <w:tcW w:w="517" w:type="pct"/>
-            <w:vAlign w:val="center"/>
-          </w:tcPr>
-          <w:p>
-            <w:pPr>
-              <w:pStyle w:val="436"/>
-              <w:spacing w:line="240" w:lineRule="exact"/>
-              <w:rPr>
-                <w:sz w:val="18"/>
-                <w:szCs w:val="18"/>
-              </w:rPr>
-            </w:pPr>
-          </w:p>
-        </w:tc>
-        <w:tc>
-          <w:tcPr>
-            <w:tcW w:w="304" w:type="pct"/>
-            <w:vAlign w:val="center"/>
-          </w:tcPr>
-          <w:p>
-            <w:pPr>
-              <w:pStyle w:val="436"/>
-              <w:spacing w:line="240" w:lineRule="exact"/>
-              <w:rPr>
-                <w:sz w:val="18"/>
-                <w:szCs w:val="18"/>
-              </w:rPr>
-            </w:pPr>
-          </w:p>
-        </w:tc>
-        <w:tc>
-          <w:tcPr>
-            <w:tcW w:w="752" w:type="pct"/>
-            <w:vAlign w:val="center"/>
-          </w:tcPr>
-          <w:p>
-            <w:pPr>
-              <w:pStyle w:val="436"/>
-              <w:spacing w:line="240" w:lineRule="exact"/>
-              <w:rPr>
-                <w:sz w:val="18"/>
-                <w:szCs w:val="18"/>
-              </w:rPr>
-            </w:pPr>
-          </w:p>
-        </w:tc>
-        <w:tc>
-          <w:tcPr>
-            <w:tcW w:w="304" w:type="pct"/>
-            <w:vAlign w:val="center"/>
-          </w:tcPr>
-          <w:p>
-            <w:pPr>
-              <w:pStyle w:val="436"/>
-              <w:spacing w:line="240" w:lineRule="exact"/>
-              <w:rPr>
-                <w:sz w:val="18"/>
-                <w:szCs w:val="18"/>
-              </w:rPr>
-            </w:pPr>
-          </w:p>
-        </w:tc>
-        <w:tc>
-          <w:tcPr>
-            <w:tcW w:w="825" w:type="pct"/>
-            <w:vAlign w:val="center"/>
-          </w:tcPr>
-          <w:p>
-            <w:pPr>
-              <w:pStyle w:val="436"/>
-              <w:spacing w:line="240" w:lineRule="exact"/>
-              <w:rPr>
-                <w:sz w:val="18"/>
-                <w:szCs w:val="18"/>
-              </w:rPr>
-            </w:pPr>
-          </w:p>
-        </w:tc>
-        <w:tc>
-          <w:tcPr>
-            <w:tcW w:w="570" w:type="pct"/>
-            <w:vAlign w:val="center"/>
-          </w:tcPr>
-          <w:p>
-            <w:pPr>
-              <w:pStyle w:val="436"/>
-              <w:spacing w:line="240" w:lineRule="exact"/>
-              <w:rPr>
-                <w:sz w:val="18"/>
-                <w:szCs w:val="18"/>
-              </w:rPr>
-            </w:pPr>
-          </w:p>
-        </w:tc>
-        <w:tc>
-          <w:tcPr>
-            <w:tcW w:w="447" w:type="pct"/>
-            <w:vAlign w:val="center"/>
-          </w:tcPr>
-          <w:p>
-            <w:pPr>
-              <w:pStyle w:val="436"/>
-              <w:spacing w:line="240" w:lineRule="exact"/>
-              <w:rPr>
-                <w:sz w:val="18"/>
-                <w:szCs w:val="18"/>
-              </w:rPr>
-            </w:pPr>
-          </w:p>
-        </w:tc>
-      </w:tr>
-      <w:tr>
-        <w:trPr>
-          <w:jc w:val="center"/>
-        </w:trPr>
-        <w:tc>
-          <w:tcPr>
-            <w:tcW w:w="473" w:type="pct"/>
-            <w:vAlign w:val="center"/>
-          </w:tcPr>
-          <w:p>
-            <w:pPr>
-              <w:pStyle w:val="436"/>
-              <w:spacing w:line="240" w:lineRule="exact"/>
-              <w:rPr>
-                <w:color w:val="FF0000"/>
-                <w:sz w:val="18"/>
-                <w:szCs w:val="18"/>
-              </w:rPr>
-            </w:pPr>
-          </w:p>
-        </w:tc>
-        <w:tc>
-          <w:tcPr>
-            <w:tcW w:w="199" w:type="pct"/>
-            <w:vAlign w:val="center"/>
-          </w:tcPr>
-          <w:p>
-            <w:pPr>
-              <w:pStyle w:val="436"/>
-              <w:spacing w:line="240" w:lineRule="exact"/>
-              <w:rPr>
-                <w:color w:val="FF0000"/>
-                <w:sz w:val="18"/>
-                <w:szCs w:val="18"/>
-              </w:rPr>
-            </w:pPr>
-            <w:r>
-              <w:rPr>
-                <w:color w:val="FF0000"/>
-                <w:sz w:val="18"/>
-                <w:szCs w:val="18"/>
-              </w:rPr>
-              <w:t>…</w:t>
-            </w:r>
-          </w:p>
-        </w:tc>
-        <w:tc>
-          <w:tcPr>
-            <w:tcW w:w="231" w:type="pct"/>
-            <w:vAlign w:val="center"/>
-          </w:tcPr>
-          <w:p>
-            <w:pPr>
-              <w:pStyle w:val="436"/>
-              <w:spacing w:line="240" w:lineRule="exact"/>
-              <w:rPr>
-                <w:color w:val="FF0000"/>
-                <w:sz w:val="18"/>
-                <w:szCs w:val="18"/>
-              </w:rPr>
-            </w:pPr>
-            <w:r>
-              <w:rPr>
-                <w:color w:val="FF0000"/>
-                <w:sz w:val="18"/>
-                <w:szCs w:val="18"/>
-              </w:rPr>
-              <w:t>…</w:t>
-            </w:r>
-          </w:p>
-        </w:tc>
-        <w:tc>
-          <w:tcPr>
-            <w:tcW w:w="375" w:type="pct"/>
-            <w:vAlign w:val="center"/>
-          </w:tcPr>
-          <w:p>
-            <w:pPr>
-              <w:pStyle w:val="436"/>
-              <w:spacing w:line="240" w:lineRule="exact"/>
-              <w:rPr>
-                <w:color w:val="FF0000"/>
-                <w:sz w:val="18"/>
-                <w:szCs w:val="18"/>
-              </w:rPr>
-            </w:pPr>
-            <w:r>
-              <w:rPr>
-                <w:rFonts w:hint="eastAsia"/>
-                <w:color w:val="FF0000"/>
-                <w:sz w:val="18"/>
-                <w:szCs w:val="18"/>
-              </w:rPr>
-              <w:t>..</w:t>
-            </w:r>
-          </w:p>
-        </w:tc>
-        <w:tc>
-          <w:tcPr>
-            <w:tcW w:w="517" w:type="pct"/>
-            <w:vAlign w:val="center"/>
-          </w:tcPr>
-          <w:p>
-            <w:pPr>
-              <w:pStyle w:val="436"/>
-              <w:spacing w:line="240" w:lineRule="exact"/>
-              <w:rPr>
-                <w:color w:val="FF0000"/>
-                <w:sz w:val="18"/>
-                <w:szCs w:val="18"/>
-              </w:rPr>
-            </w:pPr>
-          </w:p>
-        </w:tc>
-        <w:tc>
-          <w:tcPr>
-            <w:tcW w:w="304" w:type="pct"/>
-            <w:vAlign w:val="center"/>
-          </w:tcPr>
-          <w:p>
-            <w:pPr>
-              <w:pStyle w:val="436"/>
-              <w:spacing w:line="240" w:lineRule="exact"/>
-              <w:rPr>
-                <w:color w:val="FF0000"/>
-                <w:sz w:val="18"/>
-                <w:szCs w:val="18"/>
-              </w:rPr>
-            </w:pPr>
-          </w:p>
-        </w:tc>
-        <w:tc>
-          <w:tcPr>
-            <w:tcW w:w="752" w:type="pct"/>
-            <w:vAlign w:val="center"/>
-          </w:tcPr>
-          <w:p>
-            <w:pPr>
-              <w:pStyle w:val="436"/>
-              <w:spacing w:line="240" w:lineRule="exact"/>
-              <w:rPr>
-                <w:color w:val="FF0000"/>
-                <w:sz w:val="18"/>
-                <w:szCs w:val="18"/>
-              </w:rPr>
-            </w:pPr>
-          </w:p>
-        </w:tc>
-        <w:tc>
-          <w:tcPr>
-            <w:tcW w:w="304" w:type="pct"/>
-            <w:vAlign w:val="center"/>
-          </w:tcPr>
-          <w:p>
-            <w:pPr>
-              <w:pStyle w:val="436"/>
-              <w:spacing w:line="240" w:lineRule="exact"/>
-              <w:rPr>
-                <w:color w:val="FF0000"/>
-                <w:sz w:val="18"/>
-                <w:szCs w:val="18"/>
-              </w:rPr>
-            </w:pPr>
-          </w:p>
-        </w:tc>
-        <w:tc>
-          <w:tcPr>
-            <w:tcW w:w="825" w:type="pct"/>
-            <w:vAlign w:val="center"/>
-          </w:tcPr>
-          <w:p>
-            <w:pPr>
-              <w:pStyle w:val="436"/>
-              <w:spacing w:line="240" w:lineRule="exact"/>
-              <w:rPr>
-                <w:color w:val="FF0000"/>
-                <w:sz w:val="18"/>
-                <w:szCs w:val="18"/>
-              </w:rPr>
-            </w:pPr>
-          </w:p>
-        </w:tc>
-        <w:tc>
-          <w:tcPr>
-            <w:tcW w:w="570" w:type="pct"/>
-            <w:vAlign w:val="center"/>
-          </w:tcPr>
-          <w:p>
-            <w:pPr>
-              <w:pStyle w:val="436"/>
-              <w:spacing w:line="240" w:lineRule="exact"/>
-              <w:rPr>
-                <w:color w:val="FF0000"/>
-                <w:sz w:val="18"/>
-                <w:szCs w:val="18"/>
-              </w:rPr>
-            </w:pPr>
-          </w:p>
-        </w:tc>
-        <w:tc>
-          <w:tcPr>
-            <w:tcW w:w="447" w:type="pct"/>
-            <w:vAlign w:val="center"/>
-          </w:tcPr>
-          <w:p>
-            <w:pPr>
-              <w:pStyle w:val="436"/>
-              <w:spacing w:line="240" w:lineRule="exact"/>
-              <w:rPr>
-                <w:color w:val="FF0000"/>
-                <w:sz w:val="18"/>
-                <w:szCs w:val="18"/>
-              </w:rPr>
-            </w:pPr>
-          </w:p>
-        </w:tc>
-      </w:tr>
-      <w:tr>
-        <w:trPr>
-          <w:jc w:val="center"/>
-        </w:trPr>
-        <w:tc>
-          <w:tcPr>
-            <w:tcW w:w="473" w:type="pct"/>
-            <w:vAlign w:val="center"/>
-          </w:tcPr>
-          <w:p>
-            <w:pPr>
-              <w:pStyle w:val="436"/>
-              <w:spacing w:line="240" w:lineRule="exact"/>
-              <w:rPr>
-                <w:sz w:val="18"/>
-                <w:szCs w:val="18"/>
-              </w:rPr>
-            </w:pPr>
-          </w:p>
-        </w:tc>
-        <w:tc>
-          <w:tcPr>
-            <w:tcW w:w="199" w:type="pct"/>
-            <w:vAlign w:val="center"/>
-          </w:tcPr>
-          <w:p>
-            <w:pPr>
-              <w:pStyle w:val="436"/>
-              <w:spacing w:line="240" w:lineRule="exact"/>
-              <w:rPr>
-                <w:sz w:val="18"/>
-                <w:szCs w:val="18"/>
-              </w:rPr>
-            </w:pPr>
-          </w:p>
-        </w:tc>
-        <w:tc>
-          <w:tcPr>
-            <w:tcW w:w="231" w:type="pct"/>
-            <w:vAlign w:val="center"/>
-          </w:tcPr>
-          <w:p>
-            <w:pPr>
-              <w:pStyle w:val="436"/>
-              <w:spacing w:line="240" w:lineRule="exact"/>
-              <w:rPr>
-                <w:sz w:val="18"/>
-                <w:szCs w:val="18"/>
-              </w:rPr>
-            </w:pPr>
-          </w:p>
-        </w:tc>
-        <w:tc>
-          <w:tcPr>
-            <w:tcW w:w="375" w:type="pct"/>
-            <w:vAlign w:val="center"/>
-          </w:tcPr>
-          <w:p>
-            <w:pPr>
-              <w:pStyle w:val="436"/>
-              <w:spacing w:line="240" w:lineRule="exact"/>
-              <w:rPr>
-                <w:sz w:val="18"/>
-                <w:szCs w:val="18"/>
-              </w:rPr>
-            </w:pPr>
-          </w:p>
-        </w:tc>
-        <w:tc>
-          <w:tcPr>
-            <w:tcW w:w="517" w:type="pct"/>
-            <w:vAlign w:val="center"/>
-          </w:tcPr>
-          <w:p>
-            <w:pPr>
-              <w:pStyle w:val="436"/>
-              <w:spacing w:line="240" w:lineRule="exact"/>
-              <w:rPr>
-                <w:sz w:val="18"/>
-                <w:szCs w:val="18"/>
-              </w:rPr>
-            </w:pPr>
-          </w:p>
-        </w:tc>
-        <w:tc>
-          <w:tcPr>
-            <w:tcW w:w="304" w:type="pct"/>
-            <w:vAlign w:val="center"/>
-          </w:tcPr>
-          <w:p>
-            <w:pPr>
-              <w:pStyle w:val="436"/>
-              <w:spacing w:line="240" w:lineRule="exact"/>
-              <w:rPr>
-                <w:sz w:val="18"/>
-                <w:szCs w:val="18"/>
-              </w:rPr>
-            </w:pPr>
-          </w:p>
-        </w:tc>
-        <w:tc>
-          <w:tcPr>
-            <w:tcW w:w="752" w:type="pct"/>
-            <w:vAlign w:val="center"/>
-          </w:tcPr>
-          <w:p>
-            <w:pPr>
-              <w:pStyle w:val="436"/>
-              <w:spacing w:line="240" w:lineRule="exact"/>
-              <w:rPr>
-                <w:sz w:val="18"/>
-                <w:szCs w:val="18"/>
-              </w:rPr>
-            </w:pPr>
-          </w:p>
-        </w:tc>
-        <w:tc>
-          <w:tcPr>
-            <w:tcW w:w="304" w:type="pct"/>
-            <w:vAlign w:val="center"/>
-          </w:tcPr>
-          <w:p>
-            <w:pPr>
-              <w:pStyle w:val="436"/>
-              <w:spacing w:line="240" w:lineRule="exact"/>
-              <w:rPr>
-                <w:sz w:val="18"/>
-                <w:szCs w:val="18"/>
-              </w:rPr>
-            </w:pPr>
-          </w:p>
-        </w:tc>
-        <w:tc>
-          <w:tcPr>
-            <w:tcW w:w="825" w:type="pct"/>
-            <w:vAlign w:val="center"/>
-          </w:tcPr>
-          <w:p>
-            <w:pPr>
-              <w:pStyle w:val="436"/>
-              <w:spacing w:line="240" w:lineRule="exact"/>
-              <w:rPr>
-                <w:sz w:val="18"/>
-                <w:szCs w:val="18"/>
-              </w:rPr>
-            </w:pPr>
-          </w:p>
-        </w:tc>
-        <w:tc>
-          <w:tcPr>
-            <w:tcW w:w="570" w:type="pct"/>
-            <w:vAlign w:val="center"/>
-          </w:tcPr>
-          <w:p>
-            <w:pPr>
-              <w:pStyle w:val="436"/>
-              <w:spacing w:line="240" w:lineRule="exact"/>
-              <w:rPr>
-                <w:sz w:val="18"/>
-                <w:szCs w:val="18"/>
-              </w:rPr>
-            </w:pPr>
-          </w:p>
-        </w:tc>
-        <w:tc>
-          <w:tcPr>
-            <w:tcW w:w="447" w:type="pct"/>
-            <w:vAlign w:val="center"/>
-          </w:tcPr>
-          <w:p>
-            <w:pPr>
-              <w:pStyle w:val="436"/>
-              <w:spacing w:line="240" w:lineRule="exact"/>
-              <w:rPr>
-                <w:sz w:val="18"/>
-                <w:szCs w:val="18"/>
-              </w:rPr>
-            </w:pPr>
-          </w:p>
-        </w:tc>
-      </w:tr>
-      <w:tr>
-        <w:trPr>
-          <w:jc w:val="center"/>
-        </w:trPr>
-        <w:tc>
-          <w:tcPr>
-            <w:tcW w:w="473" w:type="pct"/>
-            <w:vAlign w:val="center"/>
-          </w:tcPr>
-          <w:p>
-            <w:pPr>
-              <w:pStyle w:val="436"/>
-              <w:spacing w:line="240" w:lineRule="exact"/>
-              <w:rPr>
-                <w:sz w:val="18"/>
-                <w:szCs w:val="18"/>
-              </w:rPr>
-            </w:pPr>
-          </w:p>
-        </w:tc>
-        <w:tc>
-          <w:tcPr>
-            <w:tcW w:w="199" w:type="pct"/>
-            <w:vAlign w:val="center"/>
-          </w:tcPr>
-          <w:p>
-            <w:pPr>
-              <w:pStyle w:val="436"/>
-              <w:spacing w:line="240" w:lineRule="exact"/>
-              <w:rPr>
-                <w:sz w:val="18"/>
-                <w:szCs w:val="18"/>
-              </w:rPr>
-            </w:pPr>
-          </w:p>
-        </w:tc>
-        <w:tc>
-          <w:tcPr>
-            <w:tcW w:w="231" w:type="pct"/>
-            <w:vAlign w:val="center"/>
-          </w:tcPr>
-          <w:p>
-            <w:pPr>
-              <w:pStyle w:val="436"/>
-              <w:spacing w:line="240" w:lineRule="exact"/>
-              <w:rPr>
-                <w:sz w:val="18"/>
-                <w:szCs w:val="18"/>
-              </w:rPr>
-            </w:pPr>
-          </w:p>
-        </w:tc>
-        <w:tc>
-          <w:tcPr>
-            <w:tcW w:w="375" w:type="pct"/>
-            <w:vAlign w:val="center"/>
-          </w:tcPr>
-          <w:p>
-            <w:pPr>
-              <w:pStyle w:val="436"/>
-              <w:spacing w:line="240" w:lineRule="exact"/>
-              <w:rPr>
-                <w:sz w:val="18"/>
-                <w:szCs w:val="18"/>
-              </w:rPr>
-            </w:pPr>
-          </w:p>
-        </w:tc>
-        <w:tc>
-          <w:tcPr>
-            <w:tcW w:w="517" w:type="pct"/>
-            <w:vAlign w:val="center"/>
-          </w:tcPr>
-          <w:p>
-            <w:pPr>
-              <w:pStyle w:val="436"/>
-              <w:spacing w:line="240" w:lineRule="exact"/>
-              <w:rPr>
-                <w:sz w:val="18"/>
-                <w:szCs w:val="18"/>
-              </w:rPr>
-            </w:pPr>
-          </w:p>
-        </w:tc>
-        <w:tc>
-          <w:tcPr>
-            <w:tcW w:w="304" w:type="pct"/>
-            <w:vAlign w:val="center"/>
-          </w:tcPr>
-          <w:p>
-            <w:pPr>
-              <w:pStyle w:val="436"/>
-              <w:spacing w:line="240" w:lineRule="exact"/>
-              <w:rPr>
-                <w:sz w:val="18"/>
-                <w:szCs w:val="18"/>
-              </w:rPr>
-            </w:pPr>
-          </w:p>
-        </w:tc>
-        <w:tc>
-          <w:tcPr>
-            <w:tcW w:w="752" w:type="pct"/>
-            <w:vAlign w:val="center"/>
-          </w:tcPr>
-          <w:p>
-            <w:pPr>
-              <w:pStyle w:val="436"/>
-              <w:spacing w:line="240" w:lineRule="exact"/>
-              <w:rPr>
-                <w:sz w:val="18"/>
-                <w:szCs w:val="18"/>
-              </w:rPr>
-            </w:pPr>
-          </w:p>
-        </w:tc>
-        <w:tc>
-          <w:tcPr>
-            <w:tcW w:w="304" w:type="pct"/>
-            <w:vAlign w:val="center"/>
-          </w:tcPr>
-          <w:p>
-            <w:pPr>
-              <w:pStyle w:val="436"/>
-              <w:spacing w:line="240" w:lineRule="exact"/>
-              <w:rPr>
-                <w:sz w:val="18"/>
-                <w:szCs w:val="18"/>
-              </w:rPr>
-            </w:pPr>
-          </w:p>
-        </w:tc>
-        <w:tc>
-          <w:tcPr>
-            <w:tcW w:w="825" w:type="pct"/>
-            <w:vAlign w:val="center"/>
-          </w:tcPr>
-          <w:p>
-            <w:pPr>
-              <w:pStyle w:val="436"/>
-              <w:spacing w:line="240" w:lineRule="exact"/>
-              <w:rPr>
-                <w:sz w:val="18"/>
-                <w:szCs w:val="18"/>
-              </w:rPr>
-            </w:pPr>
-          </w:p>
-        </w:tc>
-        <w:tc>
-          <w:tcPr>
-            <w:tcW w:w="570" w:type="pct"/>
-            <w:vAlign w:val="center"/>
-          </w:tcPr>
-          <w:p>
-            <w:pPr>
-              <w:pStyle w:val="436"/>
-              <w:spacing w:line="240" w:lineRule="exact"/>
-              <w:rPr>
-                <w:sz w:val="18"/>
-                <w:szCs w:val="18"/>
-              </w:rPr>
-            </w:pPr>
-          </w:p>
-        </w:tc>
-        <w:tc>
-          <w:tcPr>
-            <w:tcW w:w="447" w:type="pct"/>
-            <w:vAlign w:val="center"/>
-          </w:tcPr>
-          <w:p>
-            <w:pPr>
-              <w:pStyle w:val="436"/>
-              <w:spacing w:line="240" w:lineRule="exact"/>
-              <w:rPr>
-                <w:sz w:val="18"/>
-                <w:szCs w:val="18"/>
-              </w:rPr>
-            </w:pPr>
-          </w:p>
-        </w:tc>
-      </w:tr>
-      <w:tr>
-        <w:trPr>
-          <w:jc w:val="center"/>
-        </w:trPr>
-        <w:tc>
-          <w:tcPr>
-            <w:tcW w:w="473" w:type="pct"/>
-            <w:vAlign w:val="center"/>
-          </w:tcPr>
-          <w:p>
-            <w:pPr>
-              <w:pStyle w:val="436"/>
-              <w:spacing w:line="240" w:lineRule="exact"/>
-              <w:rPr>
-                <w:sz w:val="18"/>
-                <w:szCs w:val="18"/>
-              </w:rPr>
-            </w:pPr>
-          </w:p>
-        </w:tc>
-        <w:tc>
-          <w:tcPr>
-            <w:tcW w:w="199" w:type="pct"/>
-            <w:vAlign w:val="center"/>
-          </w:tcPr>
-          <w:p>
-            <w:pPr>
-              <w:pStyle w:val="436"/>
-              <w:spacing w:line="240" w:lineRule="exact"/>
-              <w:rPr>
-                <w:sz w:val="18"/>
-                <w:szCs w:val="18"/>
-              </w:rPr>
-            </w:pPr>
-          </w:p>
-        </w:tc>
-        <w:tc>
-          <w:tcPr>
-            <w:tcW w:w="231" w:type="pct"/>
-            <w:vAlign w:val="center"/>
-          </w:tcPr>
-          <w:p>
-            <w:pPr>
-              <w:pStyle w:val="436"/>
-              <w:spacing w:line="240" w:lineRule="exact"/>
-              <w:rPr>
-                <w:sz w:val="18"/>
-                <w:szCs w:val="18"/>
-              </w:rPr>
-            </w:pPr>
-          </w:p>
-        </w:tc>
-        <w:tc>
-          <w:tcPr>
-            <w:tcW w:w="375" w:type="pct"/>
-            <w:vAlign w:val="center"/>
-          </w:tcPr>
-          <w:p>
-            <w:pPr>
-              <w:pStyle w:val="436"/>
-              <w:spacing w:line="240" w:lineRule="exact"/>
-              <w:rPr>
-                <w:sz w:val="18"/>
-                <w:szCs w:val="18"/>
-              </w:rPr>
-            </w:pPr>
-          </w:p>
-        </w:tc>
-        <w:tc>
-          <w:tcPr>
-            <w:tcW w:w="517" w:type="pct"/>
-            <w:vAlign w:val="center"/>
-          </w:tcPr>
-          <w:p>
-            <w:pPr>
-              <w:pStyle w:val="436"/>
-              <w:spacing w:line="240" w:lineRule="exact"/>
-              <w:rPr>
-                <w:sz w:val="18"/>
-                <w:szCs w:val="18"/>
-              </w:rPr>
-            </w:pPr>
-          </w:p>
-        </w:tc>
-        <w:tc>
-          <w:tcPr>
-            <w:tcW w:w="304" w:type="pct"/>
-            <w:vAlign w:val="center"/>
-          </w:tcPr>
-          <w:p>
-            <w:pPr>
-              <w:pStyle w:val="436"/>
-              <w:spacing w:line="240" w:lineRule="exact"/>
-              <w:rPr>
-                <w:sz w:val="18"/>
-                <w:szCs w:val="18"/>
-              </w:rPr>
-            </w:pPr>
-          </w:p>
-        </w:tc>
-        <w:tc>
-          <w:tcPr>
-            <w:tcW w:w="752" w:type="pct"/>
-            <w:vAlign w:val="center"/>
-          </w:tcPr>
-          <w:p>
-            <w:pPr>
-              <w:pStyle w:val="436"/>
-              <w:spacing w:line="240" w:lineRule="exact"/>
-              <w:rPr>
-                <w:sz w:val="18"/>
-                <w:szCs w:val="18"/>
-              </w:rPr>
-            </w:pPr>
-          </w:p>
-        </w:tc>
-        <w:tc>
-          <w:tcPr>
-            <w:tcW w:w="304" w:type="pct"/>
-            <w:vAlign w:val="center"/>
-          </w:tcPr>
-          <w:p>
-            <w:pPr>
-              <w:pStyle w:val="436"/>
-              <w:spacing w:line="240" w:lineRule="exact"/>
-              <w:rPr>
-                <w:sz w:val="18"/>
-                <w:szCs w:val="18"/>
-              </w:rPr>
-            </w:pPr>
-          </w:p>
-        </w:tc>
-        <w:tc>
-          <w:tcPr>
-            <w:tcW w:w="825" w:type="pct"/>
-            <w:vAlign w:val="center"/>
-          </w:tcPr>
-          <w:p>
-            <w:pPr>
-              <w:pStyle w:val="436"/>
-              <w:spacing w:line="240" w:lineRule="exact"/>
-              <w:rPr>
-                <w:sz w:val="18"/>
-                <w:szCs w:val="18"/>
-              </w:rPr>
-            </w:pPr>
-          </w:p>
-        </w:tc>
-        <w:tc>
-          <w:tcPr>
-            <w:tcW w:w="570" w:type="pct"/>
-            <w:vAlign w:val="center"/>
-          </w:tcPr>
-          <w:p>
-            <w:pPr>
-              <w:pStyle w:val="436"/>
-              <w:spacing w:line="240" w:lineRule="exact"/>
-              <w:rPr>
-                <w:sz w:val="18"/>
-                <w:szCs w:val="18"/>
-              </w:rPr>
-            </w:pPr>
-          </w:p>
-        </w:tc>
-        <w:tc>
-          <w:tcPr>
-            <w:tcW w:w="447" w:type="pct"/>
-            <w:vAlign w:val="center"/>
-          </w:tcPr>
-          <w:p>
-            <w:pPr>
-              <w:pStyle w:val="436"/>
-              <w:spacing w:line="240" w:lineRule="exact"/>
-              <w:rPr>
-                <w:sz w:val="18"/>
-                <w:szCs w:val="18"/>
-              </w:rPr>
-            </w:pPr>
-          </w:p>
-        </w:tc>
-      </w:tr>
-    </w:tbl>
     <w:p>
       <w:pPr>
         <w:pStyle w:val="128"/>
@@ -10057,8 +6760,8 @@
         </w:rPr>
       </w:pPr>
       <w:bookmarkStart w:id="29" w:name="_Toc213786588"/>
-      <w:bookmarkStart w:id="30" w:name="_Toc213786580"/>
-      <w:bookmarkStart w:id="31" w:name="_Toc129268779"/>
+      <w:bookmarkStart w:id="30" w:name="_Toc129268779"/>
+      <w:bookmarkStart w:id="31" w:name="_Toc213786580"/>
       <w:r>
         <w:rPr>
           <w:rFonts w:hint="eastAsia" w:ascii="Times New Roman" w:hAnsi="Times New Roman" w:cs="Times New Roman"/>
@@ -10311,8 +7014,8 @@
       </w:pPr>
       <w:bookmarkStart w:id="40" w:name="_Toc213786590"/>
       <w:bookmarkStart w:id="41" w:name="_Hlk178890662"/>
-      <w:bookmarkStart w:id="42" w:name="_Toc153817495"/>
-      <w:bookmarkStart w:id="43" w:name="_Toc103020335"/>
+      <w:bookmarkStart w:id="42" w:name="_Toc103020335"/>
+      <w:bookmarkStart w:id="43" w:name="_Toc153817495"/>
       <w:r>
         <w:rPr>
           <w:rFonts w:hint="eastAsia" w:ascii="Times New Roman" w:hAnsi="Times New Roman" w:cs="Times New Roman"/>
@@ -10324,32 +7027,20 @@
       <w:bookmarkEnd w:id="40"/>
     </w:p>
     <w:p>
-      <w:r>
-        <w:t>${focusOnDiseases}</w:t>
-      </w:r>
-    </w:p>
-    <w:bookmarkEnd w:id="41"/>
-    <w:p>
       <w:pPr>
-        <w:pStyle w:val="3"/>
+        <w:pStyle w:val="4"/>
         <w:spacing w:before="163" w:after="163"/>
         <w:rPr>
-          <w:rFonts w:ascii="Times New Roman" w:hAnsi="Times New Roman" w:cs="Times New Roman"/>
-          <w:sz w:val="28"/>
-          <w:szCs w:val="28"/>
+          <w:rFonts w:cs="Times New Roman"/>
         </w:rPr>
       </w:pPr>
-      <w:bookmarkStart w:id="44" w:name="_Toc213786593"/>
-      <w:r>
-        <w:rPr>
-          <w:rFonts w:ascii="Times New Roman" w:hAnsi="Times New Roman" w:cs="Times New Roman"/>
-          <w:sz w:val="28"/>
-          <w:szCs w:val="28"/>
-        </w:rPr>
-        <w:t>结论与建议</w:t>
-      </w:r>
-      <w:bookmarkEnd w:id="42"/>
-      <w:bookmarkEnd w:id="43"/>
+      <w:bookmarkStart w:id="44" w:name="_Toc213786591"/>
+      <w:r>
+        <w:rPr>
+          <w:rFonts w:hint="eastAsia" w:cs="Times New Roman"/>
+        </w:rPr>
+        <w:t>重点关注病害</w:t>
+      </w:r>
       <w:bookmarkEnd w:id="44"/>
     </w:p>
     <w:p>
@@ -10359,20 +7050,39 @@
       </w:pPr>
       <w:r>
         <w:rPr>
-          <w:rFonts w:hint="eastAsia"/>
-        </w:rPr>
-        <w:t>检测结论</w:t>
+          <w:rFonts w:hint="eastAsia" w:cs="Times New Roman"/>
+        </w:rPr>
+        <w:t>主要病害成因分析</w:t>
       </w:r>
     </w:p>
     <w:p>
       <w:r>
-        <w:t>${testConclusion}</w:t>
+        <w:t>${focusOnDiseases}</w:t>
       </w:r>
     </w:p>
+    <w:bookmarkEnd w:id="41"/>
     <w:p>
-      <w:r>
-        <w:t>${testConclusionBridge}</w:t>
-      </w:r>
+      <w:pPr>
+        <w:pStyle w:val="3"/>
+        <w:spacing w:before="163" w:after="163"/>
+        <w:rPr>
+          <w:rFonts w:ascii="Times New Roman" w:hAnsi="Times New Roman" w:cs="Times New Roman"/>
+          <w:sz w:val="28"/>
+          <w:szCs w:val="28"/>
+        </w:rPr>
+      </w:pPr>
+      <w:bookmarkStart w:id="45" w:name="_Toc213786593"/>
+      <w:r>
+        <w:rPr>
+          <w:rFonts w:ascii="Times New Roman" w:hAnsi="Times New Roman" w:cs="Times New Roman"/>
+          <w:sz w:val="28"/>
+          <w:szCs w:val="28"/>
+        </w:rPr>
+        <w:t>结论与建议</w:t>
+      </w:r>
+      <w:bookmarkEnd w:id="42"/>
+      <w:bookmarkEnd w:id="43"/>
+      <w:bookmarkEnd w:id="45"/>
     </w:p>
     <w:p>
       <w:pPr>
@@ -10383,6 +7093,28 @@
         <w:rPr>
           <w:rFonts w:hint="eastAsia"/>
         </w:rPr>
+        <w:t>检测结论</w:t>
+      </w:r>
+    </w:p>
+    <w:p>
+      <w:r>
+        <w:t>${testConclusion}</w:t>
+      </w:r>
+    </w:p>
+    <w:p>
+      <w:r>
+        <w:t>${testConclusionBridge}</w:t>
+      </w:r>
+    </w:p>
+    <w:p>
+      <w:pPr>
+        <w:pStyle w:val="4"/>
+        <w:spacing w:before="163" w:after="163"/>
+      </w:pPr>
+      <w:r>
+        <w:rPr>
+          <w:rFonts w:hint="eastAsia"/>
+        </w:rPr>
         <w:t>技术建议</w:t>
       </w:r>
     </w:p>
@@ -10396,7 +7128,7 @@
         <w:sectPr>
           <w:footerReference r:id="rId15" w:type="default"/>
           <w:pgSz w:w="11906" w:h="16838"/>
-          <w:pgMar w:top="1440" w:right="1797" w:bottom="1440" w:left="1797" w:header="851" w:footer="992" w:gutter="0"/>
+          <w:pgMar w:top="1440" w:right="1797" w:bottom="1440" w:left="1797" w:header="397" w:footer="992" w:gutter="0"/>
           <w:cols w:space="720" w:num="1"/>
           <w:docGrid w:type="lines" w:linePitch="312" w:charSpace="0"/>
         </w:sectPr>
@@ -10416,7 +7148,7 @@
           <w:szCs w:val="28"/>
         </w:rPr>
       </w:pPr>
-      <w:bookmarkStart w:id="45" w:name="_Toc213786596"/>
+      <w:bookmarkStart w:id="46" w:name="_Toc213786596"/>
       <w:r>
         <w:rPr>
           <w:rFonts w:hint="eastAsia" w:ascii="Times New Roman" w:hAnsi="Times New Roman" w:cs="Times New Roman"/>
@@ -10425,15 +7157,27 @@
         </w:rPr>
         <w:t>附表</w:t>
       </w:r>
-      <w:bookmarkEnd w:id="45"/>
+      <w:bookmarkEnd w:id="46"/>
     </w:p>
     <w:p>
       <w:pPr>
         <w:pStyle w:val="441"/>
+        <w:keepNext/>
+        <w:keepLines/>
+        <w:pageBreakBefore w:val="0"/>
+        <w:widowControl/>
+        <w:kinsoku/>
+        <w:wordWrap/>
+        <w:overflowPunct/>
+        <w:topLinePunct w:val="0"/>
+        <w:autoSpaceDE/>
+        <w:autoSpaceDN/>
+        <w:bidi w:val="0"/>
         <w:adjustRightInd w:val="0"/>
         <w:snapToGrid w:val="0"/>
-        <w:spacing w:before="156" w:after="156"/>
+        <w:spacing w:before="0" w:after="0"/>
         <w:jc w:val="center"/>
+        <w:textAlignment w:val="auto"/>
         <w:outlineLvl w:val="3"/>
         <w:rPr>
           <w:rFonts w:hint="eastAsia" w:ascii="黑体" w:hAnsi="黑体" w:eastAsia="黑体" w:cs="黑体"/>
@@ -10441,9 +7185,8 @@
           <w:szCs w:val="28"/>
         </w:rPr>
       </w:pPr>
-      <w:bookmarkStart w:id="46" w:name="_Toc178925821"/>
-      <w:bookmarkStart w:id="47" w:name="_Toc11318254"/>
-      <w:bookmarkStart w:id="49" w:name="_GoBack"/>
+      <w:bookmarkStart w:id="47" w:name="_Toc178925821"/>
+      <w:bookmarkStart w:id="48" w:name="_Toc11318254"/>
       <w:r>
         <w:rPr>
           <w:rFonts w:hint="eastAsia" w:ascii="黑体" w:hAnsi="黑体" w:eastAsia="黑体" w:cs="黑体"/>
@@ -10454,104 +7197,103 @@
       </w:r>
       <w:r>
         <w:rPr>
+          <w:rFonts w:hint="default" w:ascii="Times New Roman" w:hAnsi="Times New Roman" w:eastAsia="黑体" w:cs="Times New Roman"/>
+          <w:kern w:val="2"/>
+          <w:szCs w:val="28"/>
+        </w:rPr>
+        <w:fldChar w:fldCharType="begin"/>
+      </w:r>
+      <w:r>
+        <w:rPr>
+          <w:rFonts w:hint="default" w:ascii="Times New Roman" w:hAnsi="Times New Roman" w:eastAsia="黑体" w:cs="Times New Roman"/>
+          <w:kern w:val="2"/>
+          <w:szCs w:val="28"/>
+        </w:rPr>
+        <w:instrText xml:space="preserve"> STYLEREF 1 \s </w:instrText>
+      </w:r>
+      <w:r>
+        <w:rPr>
+          <w:rFonts w:hint="default" w:ascii="Times New Roman" w:hAnsi="Times New Roman" w:eastAsia="黑体" w:cs="Times New Roman"/>
+          <w:kern w:val="2"/>
+          <w:szCs w:val="28"/>
+        </w:rPr>
+        <w:fldChar w:fldCharType="separate"/>
+      </w:r>
+      <w:r>
+        <w:rPr>
+          <w:rFonts w:hint="default" w:ascii="Times New Roman" w:hAnsi="Times New Roman" w:eastAsia="黑体" w:cs="Times New Roman"/>
+          <w:kern w:val="2"/>
+          <w:szCs w:val="28"/>
+        </w:rPr>
+        <w:t>13</w:t>
+      </w:r>
+      <w:r>
+        <w:rPr>
+          <w:rFonts w:hint="default" w:ascii="Times New Roman" w:hAnsi="Times New Roman" w:eastAsia="黑体" w:cs="Times New Roman"/>
+          <w:kern w:val="2"/>
+          <w:szCs w:val="28"/>
+        </w:rPr>
+        <w:fldChar w:fldCharType="end"/>
+      </w:r>
+      <w:r>
+        <w:rPr>
+          <w:rFonts w:hint="default" w:ascii="Times New Roman" w:hAnsi="Times New Roman" w:eastAsia="黑体" w:cs="Times New Roman"/>
+          <w:kern w:val="2"/>
+          <w:szCs w:val="28"/>
+        </w:rPr>
+        <w:t>.</w:t>
+      </w:r>
+      <w:r>
+        <w:rPr>
+          <w:rFonts w:hint="default" w:ascii="Times New Roman" w:hAnsi="Times New Roman" w:eastAsia="黑体" w:cs="Times New Roman"/>
+          <w:kern w:val="2"/>
+          <w:szCs w:val="28"/>
+        </w:rPr>
+        <w:fldChar w:fldCharType="begin"/>
+      </w:r>
+      <w:r>
+        <w:rPr>
+          <w:rFonts w:hint="default" w:ascii="Times New Roman" w:hAnsi="Times New Roman" w:eastAsia="黑体" w:cs="Times New Roman"/>
+          <w:kern w:val="2"/>
+          <w:szCs w:val="28"/>
+        </w:rPr>
+        <w:instrText xml:space="preserve"> SEQ 表 \* ARABIC \s 1 </w:instrText>
+      </w:r>
+      <w:r>
+        <w:rPr>
+          <w:rFonts w:hint="default" w:ascii="Times New Roman" w:hAnsi="Times New Roman" w:eastAsia="黑体" w:cs="Times New Roman"/>
+          <w:kern w:val="2"/>
+          <w:szCs w:val="28"/>
+        </w:rPr>
+        <w:fldChar w:fldCharType="separate"/>
+      </w:r>
+      <w:r>
+        <w:rPr>
+          <w:rFonts w:hint="default" w:ascii="Times New Roman" w:hAnsi="Times New Roman" w:eastAsia="黑体" w:cs="Times New Roman"/>
+          <w:kern w:val="2"/>
+          <w:szCs w:val="28"/>
+        </w:rPr>
+        <w:t>1</w:t>
+      </w:r>
+      <w:r>
+        <w:rPr>
+          <w:rFonts w:hint="default" w:ascii="Times New Roman" w:hAnsi="Times New Roman" w:eastAsia="黑体" w:cs="Times New Roman"/>
+          <w:kern w:val="2"/>
+          <w:szCs w:val="28"/>
+        </w:rPr>
+        <w:fldChar w:fldCharType="end"/>
+      </w:r>
+      <w:r>
+        <w:rPr>
           <w:rFonts w:hint="eastAsia" w:ascii="黑体" w:hAnsi="黑体" w:eastAsia="黑体" w:cs="黑体"/>
           <w:kern w:val="2"/>
           <w:szCs w:val="28"/>
         </w:rPr>
-        <w:fldChar w:fldCharType="begin"/>
-      </w:r>
-      <w:r>
-        <w:rPr>
-          <w:rFonts w:hint="eastAsia" w:ascii="黑体" w:hAnsi="黑体" w:eastAsia="黑体" w:cs="黑体"/>
-          <w:kern w:val="2"/>
-          <w:szCs w:val="28"/>
-        </w:rPr>
-        <w:instrText xml:space="preserve"> STYLEREF 1 \s </w:instrText>
-      </w:r>
-      <w:r>
-        <w:rPr>
-          <w:rFonts w:hint="eastAsia" w:ascii="黑体" w:hAnsi="黑体" w:eastAsia="黑体" w:cs="黑体"/>
-          <w:kern w:val="2"/>
-          <w:szCs w:val="28"/>
-        </w:rPr>
-        <w:fldChar w:fldCharType="separate"/>
-      </w:r>
-      <w:r>
-        <w:rPr>
-          <w:rFonts w:hint="eastAsia" w:ascii="黑体" w:hAnsi="黑体" w:eastAsia="黑体" w:cs="黑体"/>
-          <w:kern w:val="2"/>
-          <w:szCs w:val="28"/>
-        </w:rPr>
-        <w:t>13</w:t>
-      </w:r>
-      <w:r>
-        <w:rPr>
-          <w:rFonts w:hint="eastAsia" w:ascii="黑体" w:hAnsi="黑体" w:eastAsia="黑体" w:cs="黑体"/>
-          <w:kern w:val="2"/>
-          <w:szCs w:val="28"/>
-        </w:rPr>
-        <w:fldChar w:fldCharType="end"/>
-      </w:r>
-      <w:r>
-        <w:rPr>
-          <w:rFonts w:hint="eastAsia" w:ascii="黑体" w:hAnsi="黑体" w:eastAsia="黑体" w:cs="黑体"/>
-          <w:kern w:val="2"/>
-          <w:szCs w:val="28"/>
-        </w:rPr>
-        <w:t>.</w:t>
-      </w:r>
-      <w:r>
-        <w:rPr>
-          <w:rFonts w:hint="eastAsia" w:ascii="黑体" w:hAnsi="黑体" w:eastAsia="黑体" w:cs="黑体"/>
-          <w:kern w:val="2"/>
-          <w:szCs w:val="28"/>
-        </w:rPr>
-        <w:fldChar w:fldCharType="begin"/>
-      </w:r>
-      <w:r>
-        <w:rPr>
-          <w:rFonts w:hint="eastAsia" w:ascii="黑体" w:hAnsi="黑体" w:eastAsia="黑体" w:cs="黑体"/>
-          <w:kern w:val="2"/>
-          <w:szCs w:val="28"/>
-        </w:rPr>
-        <w:instrText xml:space="preserve"> SEQ 表 \* ARABIC \s 1 </w:instrText>
-      </w:r>
-      <w:r>
-        <w:rPr>
-          <w:rFonts w:hint="eastAsia" w:ascii="黑体" w:hAnsi="黑体" w:eastAsia="黑体" w:cs="黑体"/>
-          <w:kern w:val="2"/>
-          <w:szCs w:val="28"/>
-        </w:rPr>
-        <w:fldChar w:fldCharType="separate"/>
-      </w:r>
-      <w:r>
-        <w:rPr>
-          <w:rFonts w:hint="eastAsia" w:ascii="黑体" w:hAnsi="黑体" w:eastAsia="黑体" w:cs="黑体"/>
-          <w:kern w:val="2"/>
-          <w:szCs w:val="28"/>
-        </w:rPr>
-        <w:t>1</w:t>
-      </w:r>
-      <w:r>
-        <w:rPr>
-          <w:rFonts w:hint="eastAsia" w:ascii="黑体" w:hAnsi="黑体" w:eastAsia="黑体" w:cs="黑体"/>
-          <w:kern w:val="2"/>
-          <w:szCs w:val="28"/>
-        </w:rPr>
-        <w:fldChar w:fldCharType="end"/>
-      </w:r>
-      <w:r>
-        <w:rPr>
-          <w:rFonts w:hint="eastAsia" w:ascii="黑体" w:hAnsi="黑体" w:eastAsia="黑体" w:cs="黑体"/>
-          <w:kern w:val="2"/>
-          <w:szCs w:val="28"/>
-        </w:rPr>
         <w:t>桥梁基本状况卡片</w:t>
       </w:r>
-      <w:bookmarkEnd w:id="46"/>
       <w:bookmarkEnd w:id="47"/>
+      <w:bookmarkEnd w:id="48"/>
     </w:p>
-    <w:bookmarkEnd w:id="49"/>
     <w:tbl>
       <w:tblPr>
         <w:tblStyle w:val="45"/>
@@ -10640,7 +7382,7 @@
                 <w:szCs w:val="18"/>
               </w:rPr>
             </w:pPr>
-            <w:bookmarkStart w:id="48" w:name="_Toc11318255"/>
+            <w:bookmarkStart w:id="49" w:name="_Toc11318255"/>
             <w:r>
               <w:rPr>
                 <w:rFonts w:eastAsia="宋体" w:cs="Times New Roman"/>
@@ -23699,7 +20441,7 @@
         </w:sectPr>
       </w:pPr>
     </w:p>
-    <w:bookmarkEnd w:id="48"/>
+    <w:bookmarkEnd w:id="49"/>
     <w:p>
       <w:pPr>
         <w:pStyle w:val="448"/>
@@ -29996,6 +26738,7 @@
     </w:p>
     <w:sectPr>
       <w:pgSz w:w="11906" w:h="16838"/>
+      <w:pgMar w:top="1440" w:right="1800" w:bottom="1440" w:left="1800" w:header="397" w:footer="720" w:gutter="0"/>
       <w:cols w:space="720" w:num="1"/>
       <w:docGrid w:type="lines" w:linePitch="312" w:charSpace="0"/>
     </w:sectPr>
@@ -30499,7 +27242,15 @@
   <w:p>
     <w:pPr>
       <w:pStyle w:val="29"/>
-      <w:jc w:val="left"/>
+      <w:tabs>
+        <w:tab w:val="right" w:pos="4153"/>
+        <w:tab w:val="left" w:pos="13039"/>
+      </w:tabs>
+      <w:jc w:val="both"/>
+      <w:rPr>
+        <w:rFonts w:hint="eastAsia" w:eastAsia="黑体"/>
+        <w:lang w:eastAsia="zh-CN"/>
+      </w:rPr>
     </w:pPr>
     <w:r>
       <w:rPr>
@@ -30515,7 +27266,11 @@
       <w:t>测报告</w:t>
     </w:r>
     <w:r>
-      <w:ptab w:relativeTo="margin" w:alignment="right" w:leader="none"/>
+      <w:rPr>
+        <w:rFonts w:hint="eastAsia" w:eastAsia="黑体"/>
+        <w:lang w:eastAsia="zh-CN"/>
+      </w:rPr>
+      <w:ptab w:relativeTo="indent" w:alignment="right" w:leader="none"/>
     </w:r>
     <w:r>
       <w:rPr>
@@ -30526,7 +27281,7 @@
       <w:drawing>
         <wp:inline distT="0" distB="0" distL="0" distR="0">
           <wp:extent cx="619125" cy="356235"/>
-          <wp:effectExtent l="0" t="0" r="5715" b="9525"/>
+          <wp:effectExtent l="0" t="0" r="15875" b="24765"/>
           <wp:docPr id="10" name="图片 10" descr="logo（湖北交投智能检测股份有限公司）"/>
           <wp:cNvGraphicFramePr>
             <a:graphicFrameLocks xmlns:a="http://schemas.openxmlformats.org/drawingml/2006/main" noChangeAspect="1"/>

</xml_diff>